<commit_message>
docs: update CivicCore suite references
</commit_message>
<xml_diff>
--- a/USER-MANUAL.docx
+++ b/USER-MANUAL.docx
@@ -916,6 +916,42 @@
       </w:r>
     </w:p>
     <w:p>
+      <w:r>
+        <w:drawing>
+          <wp:inline xmlns:a="http://schemas.openxmlformats.org/drawingml/2006/main" xmlns:pic="http://schemas.openxmlformats.org/drawingml/2006/picture">
+            <wp:extent cx="5486400" cy="6660444"/>
+            <wp:docPr id="1" name="Picture 1"/>
+            <wp:cNvGraphicFramePr>
+              <a:graphicFrameLocks noChangeAspect="1"/>
+            </wp:cNvGraphicFramePr>
+            <a:graphic>
+              <a:graphicData uri="http://schemas.openxmlformats.org/drawingml/2006/picture">
+                <pic:pic>
+                  <pic:nvPicPr>
+                    <pic:cNvPr id="0" name="civiccore-extraction-map.png"/>
+                    <pic:cNvPicPr/>
+                  </pic:nvPicPr>
+                  <pic:blipFill>
+                    <a:blip r:embed="rId9"/>
+                    <a:stretch>
+                      <a:fillRect/>
+                    </a:stretch>
+                  </pic:blipFill>
+                  <pic:spPr>
+                    <a:xfrm>
+                      <a:off x="0" y="0"/>
+                      <a:ext cx="5486400" cy="6660444"/>
+                    </a:xfrm>
+                    <a:prstGeom prst="rect"/>
+                  </pic:spPr>
+                </pic:pic>
+              </a:graphicData>
+            </a:graphic>
+          </wp:inline>
+        </w:drawing>
+      </w:r>
+    </w:p>
+    <w:p>
       <w:pPr>
         <w:pStyle w:val="Heading3"/>
       </w:pPr>
@@ -1027,6 +1063,42 @@
       </w:r>
     </w:p>
     <w:p>
+      <w:r>
+        <w:drawing>
+          <wp:inline xmlns:a="http://schemas.openxmlformats.org/drawingml/2006/main" xmlns:pic="http://schemas.openxmlformats.org/drawingml/2006/picture">
+            <wp:extent cx="5486400" cy="3511296"/>
+            <wp:docPr id="2" name="Picture 2"/>
+            <wp:cNvGraphicFramePr>
+              <a:graphicFrameLocks noChangeAspect="1"/>
+            </wp:cNvGraphicFramePr>
+            <a:graphic>
+              <a:graphicData uri="http://schemas.openxmlformats.org/drawingml/2006/picture">
+                <pic:pic>
+                  <pic:nvPicPr>
+                    <pic:cNvPr id="0" name="migration-order.png"/>
+                    <pic:cNvPicPr/>
+                  </pic:nvPicPr>
+                  <pic:blipFill>
+                    <a:blip r:embed="rId10"/>
+                    <a:stretch>
+                      <a:fillRect/>
+                    </a:stretch>
+                  </pic:blipFill>
+                  <pic:spPr>
+                    <a:xfrm>
+                      <a:off x="0" y="0"/>
+                      <a:ext cx="5486400" cy="3511296"/>
+                    </a:xfrm>
+                    <a:prstGeom prst="rect"/>
+                  </pic:spPr>
+                </pic:pic>
+              </a:graphicData>
+            </a:graphic>
+          </wp:inline>
+        </w:drawing>
+      </w:r>
+    </w:p>
+    <w:p>
       <w:pPr>
         <w:pStyle w:val="Heading3"/>
       </w:pPr>
@@ -1071,6 +1143,42 @@
     <w:p>
       <w:r>
         <w:t>providers implement transport, auth, and serialization details.</w:t>
+      </w:r>
+    </w:p>
+    <w:p>
+      <w:r>
+        <w:drawing>
+          <wp:inline xmlns:a="http://schemas.openxmlformats.org/drawingml/2006/main" xmlns:pic="http://schemas.openxmlformats.org/drawingml/2006/picture">
+            <wp:extent cx="5486400" cy="1717964"/>
+            <wp:docPr id="3" name="Picture 3"/>
+            <wp:cNvGraphicFramePr>
+              <a:graphicFrameLocks noChangeAspect="1"/>
+            </wp:cNvGraphicFramePr>
+            <a:graphic>
+              <a:graphicData uri="http://schemas.openxmlformats.org/drawingml/2006/picture">
+                <pic:pic>
+                  <pic:nvPicPr>
+                    <pic:cNvPr id="0" name="provider-abstraction.png"/>
+                    <pic:cNvPicPr/>
+                  </pic:nvPicPr>
+                  <pic:blipFill>
+                    <a:blip r:embed="rId11"/>
+                    <a:stretch>
+                      <a:fillRect/>
+                    </a:stretch>
+                  </pic:blipFill>
+                  <pic:spPr>
+                    <a:xfrm>
+                      <a:off x="0" y="0"/>
+                      <a:ext cx="5486400" cy="1717964"/>
+                    </a:xfrm>
+                    <a:prstGeom prst="rect"/>
+                  </pic:spPr>
+                </pic:pic>
+              </a:graphicData>
+            </a:graphic>
+          </wp:inline>
+        </w:drawing>
       </w:r>
     </w:p>
     <w:p>

</xml_diff>

<commit_message>
docs: architecture graphics and suite reference cleanup (#13)
* docs: correct civiccore package capability metadata

* docs: update CivicCore suite references

---------

Co-authored-by: Scott Converse <scott@civicsuite.local>
</commit_message>
<xml_diff>
--- a/USER-MANUAL.docx
+++ b/USER-MANUAL.docx
@@ -916,6 +916,42 @@
       </w:r>
     </w:p>
     <w:p>
+      <w:r>
+        <w:drawing>
+          <wp:inline xmlns:a="http://schemas.openxmlformats.org/drawingml/2006/main" xmlns:pic="http://schemas.openxmlformats.org/drawingml/2006/picture">
+            <wp:extent cx="5486400" cy="6660444"/>
+            <wp:docPr id="1" name="Picture 1"/>
+            <wp:cNvGraphicFramePr>
+              <a:graphicFrameLocks noChangeAspect="1"/>
+            </wp:cNvGraphicFramePr>
+            <a:graphic>
+              <a:graphicData uri="http://schemas.openxmlformats.org/drawingml/2006/picture">
+                <pic:pic>
+                  <pic:nvPicPr>
+                    <pic:cNvPr id="0" name="civiccore-extraction-map.png"/>
+                    <pic:cNvPicPr/>
+                  </pic:nvPicPr>
+                  <pic:blipFill>
+                    <a:blip r:embed="rId9"/>
+                    <a:stretch>
+                      <a:fillRect/>
+                    </a:stretch>
+                  </pic:blipFill>
+                  <pic:spPr>
+                    <a:xfrm>
+                      <a:off x="0" y="0"/>
+                      <a:ext cx="5486400" cy="6660444"/>
+                    </a:xfrm>
+                    <a:prstGeom prst="rect"/>
+                  </pic:spPr>
+                </pic:pic>
+              </a:graphicData>
+            </a:graphic>
+          </wp:inline>
+        </w:drawing>
+      </w:r>
+    </w:p>
+    <w:p>
       <w:pPr>
         <w:pStyle w:val="Heading3"/>
       </w:pPr>
@@ -1027,6 +1063,42 @@
       </w:r>
     </w:p>
     <w:p>
+      <w:r>
+        <w:drawing>
+          <wp:inline xmlns:a="http://schemas.openxmlformats.org/drawingml/2006/main" xmlns:pic="http://schemas.openxmlformats.org/drawingml/2006/picture">
+            <wp:extent cx="5486400" cy="3511296"/>
+            <wp:docPr id="2" name="Picture 2"/>
+            <wp:cNvGraphicFramePr>
+              <a:graphicFrameLocks noChangeAspect="1"/>
+            </wp:cNvGraphicFramePr>
+            <a:graphic>
+              <a:graphicData uri="http://schemas.openxmlformats.org/drawingml/2006/picture">
+                <pic:pic>
+                  <pic:nvPicPr>
+                    <pic:cNvPr id="0" name="migration-order.png"/>
+                    <pic:cNvPicPr/>
+                  </pic:nvPicPr>
+                  <pic:blipFill>
+                    <a:blip r:embed="rId10"/>
+                    <a:stretch>
+                      <a:fillRect/>
+                    </a:stretch>
+                  </pic:blipFill>
+                  <pic:spPr>
+                    <a:xfrm>
+                      <a:off x="0" y="0"/>
+                      <a:ext cx="5486400" cy="3511296"/>
+                    </a:xfrm>
+                    <a:prstGeom prst="rect"/>
+                  </pic:spPr>
+                </pic:pic>
+              </a:graphicData>
+            </a:graphic>
+          </wp:inline>
+        </w:drawing>
+      </w:r>
+    </w:p>
+    <w:p>
       <w:pPr>
         <w:pStyle w:val="Heading3"/>
       </w:pPr>
@@ -1071,6 +1143,42 @@
     <w:p>
       <w:r>
         <w:t>providers implement transport, auth, and serialization details.</w:t>
+      </w:r>
+    </w:p>
+    <w:p>
+      <w:r>
+        <w:drawing>
+          <wp:inline xmlns:a="http://schemas.openxmlformats.org/drawingml/2006/main" xmlns:pic="http://schemas.openxmlformats.org/drawingml/2006/picture">
+            <wp:extent cx="5486400" cy="1717964"/>
+            <wp:docPr id="3" name="Picture 3"/>
+            <wp:cNvGraphicFramePr>
+              <a:graphicFrameLocks noChangeAspect="1"/>
+            </wp:cNvGraphicFramePr>
+            <a:graphic>
+              <a:graphicData uri="http://schemas.openxmlformats.org/drawingml/2006/picture">
+                <pic:pic>
+                  <pic:nvPicPr>
+                    <pic:cNvPr id="0" name="provider-abstraction.png"/>
+                    <pic:cNvPicPr/>
+                  </pic:nvPicPr>
+                  <pic:blipFill>
+                    <a:blip r:embed="rId11"/>
+                    <a:stretch>
+                      <a:fillRect/>
+                    </a:stretch>
+                  </pic:blipFill>
+                  <pic:spPr>
+                    <a:xfrm>
+                      <a:off x="0" y="0"/>
+                      <a:ext cx="5486400" cy="1717964"/>
+                    </a:xfrm>
+                    <a:prstGeom prst="rect"/>
+                  </pic:spPr>
+                </pic:pic>
+              </a:graphicData>
+            </a:graphic>
+          </wp:inline>
+        </w:drawing>
       </w:r>
     </w:p>
     <w:p>

</xml_diff>

<commit_message>
feat: add civiccore v0.3 shared primitives
</commit_message>
<xml_diff>
--- a/USER-MANUAL.docx
+++ b/USER-MANUAL.docx
@@ -4,7 +4,7 @@
   <w:body>
     <w:p>
       <w:pPr>
-        <w:pStyle w:val="Heading1"/>
+        <w:pStyle w:val="Title"/>
       </w:pPr>
       <w:r>
         <w:t>CivicCore User Manual</w:t>
@@ -12,7 +12,7 @@
     </w:p>
     <w:p>
       <w:r>
-        <w:t>Version: v0.2.0</w:t>
+        <w:t>Version: v0.3.0</w:t>
       </w:r>
     </w:p>
     <w:p>
@@ -27,57 +27,40 @@
     </w:p>
     <w:p>
       <w:r>
-        <w:t>This manual has three audiences. Read the section for your role.</w:t>
+        <w:t>This manual has three audiences:</w:t>
       </w:r>
     </w:p>
     <w:p>
+      <w:pPr>
+        <w:pStyle w:val="ListNumber"/>
+      </w:pPr>
       <w:r>
-        <w:t>1. **Non-technical overview for evaluators** — what civiccore is and why it</w:t>
+        <w:t>Non-technical evaluators - what CivicCore is and why it matters.</w:t>
       </w:r>
     </w:p>
     <w:p>
+      <w:pPr>
+        <w:pStyle w:val="ListNumber"/>
+      </w:pPr>
       <w:r>
-        <w:t>exists.</w:t>
+        <w:t>IT and module developers - how to install it and consume the public API.</w:t>
       </w:r>
     </w:p>
     <w:p>
+      <w:pPr>
+        <w:pStyle w:val="ListNumber"/>
+      </w:pPr>
       <w:r>
-        <w:t>2. **Technical guide for module developers and IT integrators** — install,</w:t>
+        <w:t>Architecture reviewers - what ships today, what is planned, and how the library fits into the CivicSuite stack.</w:t>
       </w:r>
     </w:p>
+    <w:p/>
     <w:p>
+      <w:pPr>
+        <w:pStyle w:val="Heading1"/>
+      </w:pPr>
       <w:r>
-        <w:t>consume the public API, run civiccore migrations from a downstream</w:t>
-      </w:r>
-    </w:p>
-    <w:p>
-      <w:r>
-        <w:t>alembic chain.</w:t>
-      </w:r>
-    </w:p>
-    <w:p>
-      <w:r>
-        <w:t>3. **Architecture reference** — shipped submodules (migration runner,</w:t>
-      </w:r>
-    </w:p>
-    <w:p>
-      <w:r>
-        <w:t>shared `Base`, LLM provider registry, prompt-template engine, model</w:t>
-      </w:r>
-    </w:p>
-    <w:p>
-      <w:r>
-        <w:t>registry, context utilities, structured output), the list of planned</w:t>
-      </w:r>
-    </w:p>
-    <w:p>
-      <w:r>
-        <w:t>placeholder namespaces, and a text diagram of how they fit together.</w:t>
-      </w:r>
-    </w:p>
-    <w:p>
-      <w:r>
-        <w:t>---</w:t>
+        <w:t>1. Non-Technical Overview</w:t>
       </w:r>
     </w:p>
     <w:p>
@@ -85,60 +68,50 @@
         <w:pStyle w:val="Heading2"/>
       </w:pPr>
       <w:r>
-        <w:t>1. Non-technical overview for evaluators</w:t>
+        <w:t>What CivicCore Is</w:t>
+      </w:r>
+    </w:p>
+    <w:p>
+      <w:r>
+        <w:t>CivicCore is the shared platform library underneath CivicSuite. It is the common</w:t>
+      </w:r>
+    </w:p>
+    <w:p>
+      <w:r>
+        <w:t>Python package that CivicSuite modules use for migrations, LLM plumbing,</w:t>
+      </w:r>
+    </w:p>
+    <w:p>
+      <w:r>
+        <w:t>provenance metadata, audit-chain primitives, export manifests, and local city</w:t>
+      </w:r>
+    </w:p>
+    <w:p>
+      <w:r>
+        <w:t>configuration.</w:t>
+      </w:r>
+    </w:p>
+    <w:p>
+      <w:r>
+        <w:t>It is not an app a clerk or resident logs into. End users interact with</w:t>
+      </w:r>
+    </w:p>
+    <w:p>
+      <w:r>
+        <w:t>module applications such as CivicRecords AI or CivicClerk. CivicCore is the</w:t>
+      </w:r>
+    </w:p>
+    <w:p>
+      <w:r>
+        <w:t>shared foundation those applications import.</w:t>
       </w:r>
     </w:p>
     <w:p>
       <w:pPr>
-        <w:pStyle w:val="Heading3"/>
+        <w:pStyle w:val="Heading2"/>
       </w:pPr>
       <w:r>
-        <w:t>What is CivicCore?</w:t>
-      </w:r>
-    </w:p>
-    <w:p>
-      <w:r>
-        <w:t>CivicCore is a **shared platform library** that sits underneath every product</w:t>
-      </w:r>
-    </w:p>
-    <w:p>
-      <w:r>
-        <w:t>in the CivicSuite family. The CivicSuite family is a set of open-source</w:t>
-      </w:r>
-    </w:p>
-    <w:p>
-      <w:r>
-        <w:t>municipal operations applications — the first one shipped is **CivicRecords AI**,</w:t>
-      </w:r>
-    </w:p>
-    <w:p>
-      <w:r>
-        <w:t>a public-records request management app for city governments. Future</w:t>
-      </w:r>
-    </w:p>
-    <w:p>
-      <w:r>
-        <w:t>modules (CivicClerk, CivicCode, CivicZone) will follow.</w:t>
-      </w:r>
-    </w:p>
-    <w:p>
-      <w:r>
-        <w:t>Rather than each of those apps re-inventing the same plumbing, CivicCore</w:t>
-      </w:r>
-    </w:p>
-    <w:p>
-      <w:r>
-        <w:t>provides one shared, audited, semver-stable implementation that each</w:t>
-      </w:r>
-    </w:p>
-    <w:p>
-      <w:r>
-        <w:t>module imports.</w:t>
-      </w:r>
-    </w:p>
-    <w:p>
-      <w:r>
-        <w:t>**What v0.2.0 actually ships:**</w:t>
+        <w:t>What v0.3.0 Ships</w:t>
       </w:r>
     </w:p>
     <w:p>
@@ -146,17 +119,12 @@
         <w:pStyle w:val="ListBullet"/>
       </w:pPr>
       <w:r>
-        <w:t>`civiccore.migrations` — migration runner with idempotent guards plus</w:t>
+        <w:t>civiccore.migrations - migration runner, idempotent guards, and the shared</w:t>
       </w:r>
     </w:p>
     <w:p>
       <w:r>
-        <w:t>the `civiccore_0001_baseline_v1` shared-schema baseline and the</w:t>
-      </w:r>
-    </w:p>
-    <w:p>
-      <w:r>
-        <w:t>`civiccore_0002_llm` Phase 2 ALTER.</w:t>
+        <w:t xml:space="preserve">  schema baseline.</w:t>
       </w:r>
     </w:p>
     <w:p>
@@ -164,7 +132,7 @@
         <w:pStyle w:val="ListBullet"/>
       </w:pPr>
       <w:r>
-        <w:t>`civiccore.db` — shared SQLAlchemy declarative `Base`.</w:t>
+        <w:t>civiccore.db - shared SQLAlchemy declarative Base.</w:t>
       </w:r>
     </w:p>
     <w:p>
@@ -172,103 +140,12 @@
         <w:pStyle w:val="ListBullet"/>
       </w:pPr>
       <w:r>
-        <w:t>`civiccore.llm` — LLM provider abstraction (Ollama / OpenAI /</w:t>
+        <w:t>civiccore.llm - provider registry, prompt templates, model registry,</w:t>
       </w:r>
     </w:p>
     <w:p>
       <w:r>
-        <w:t>Anthropic), prompt template engine with 3-step override resolver, model</w:t>
-      </w:r>
-    </w:p>
-    <w:p>
-      <w:r>
-        <w:t>registry service + admin router, context utilities with prompt-injection</w:t>
-      </w:r>
-    </w:p>
-    <w:p>
-      <w:r>
-        <w:t>defense, and Pydantic-validated structured output.</w:t>
-      </w:r>
-    </w:p>
-    <w:p>
-      <w:r>
-        <w:t>**Planned extraction targets (not yet implemented).** The following</w:t>
-      </w:r>
-    </w:p>
-    <w:p>
-      <w:r>
-        <w:t>namespaces have placeholder `__init__.py` files reserving the import path</w:t>
-      </w:r>
-    </w:p>
-    <w:p>
-      <w:r>
-        <w:t>but ship no implementation in v0.2.0: `civiccore.audit`, `civiccore.auth`,</w:t>
-      </w:r>
-    </w:p>
-    <w:p>
-      <w:r>
-        <w:t>`civiccore.catalog`, `civiccore.connectors`, `civiccore.exemptions`</w:t>
-      </w:r>
-    </w:p>
-    <w:p>
-      <w:r>
-        <w:t>(50-state public-records exemption engine), `civiccore.ingest` (document</w:t>
-      </w:r>
-    </w:p>
-    <w:p>
-      <w:r>
-        <w:t>ingestion), `civiccore.notifications`, `civiccore.onboarding`,</w:t>
-      </w:r>
-    </w:p>
-    <w:p>
-      <w:r>
-        <w:t>`civiccore.scaffold`, `civiccore.search` (hybrid search), and</w:t>
-      </w:r>
-    </w:p>
-    <w:p>
-      <w:r>
-        <w:t>`civiccore.verification` (sovereignty verification). These will land in</w:t>
-      </w:r>
-    </w:p>
-    <w:p>
-      <w:r>
-        <w:t>future Phase releases and must not be relied on by downstream modules</w:t>
-      </w:r>
-    </w:p>
-    <w:p>
-      <w:r>
-        <w:t>until they do.</w:t>
-      </w:r>
-    </w:p>
-    <w:p>
-      <w:pPr>
-        <w:pStyle w:val="Heading3"/>
-      </w:pPr>
-      <w:r>
-        <w:t>What CivicCore is not</w:t>
-      </w:r>
-    </w:p>
-    <w:p>
-      <w:r>
-        <w:t>CivicCore is **not** an end-user application. A city clerk does not "install</w:t>
-      </w:r>
-    </w:p>
-    <w:p>
-      <w:r>
-        <w:t>CivicCore." A resident does not "log in to CivicCore." CivicCore is a</w:t>
-      </w:r>
-    </w:p>
-    <w:p>
-      <w:r>
-        <w:t>library that the actual end-user apps depend on.</w:t>
-      </w:r>
-    </w:p>
-    <w:p>
-      <w:pPr>
-        <w:pStyle w:val="Heading3"/>
-      </w:pPr>
-      <w:r>
-        <w:t>Who consumes CivicCore today</w:t>
+        <w:t xml:space="preserve">  context utilities, and structured-output helpers.</w:t>
       </w:r>
     </w:p>
     <w:p>
@@ -276,25 +153,12 @@
         <w:pStyle w:val="ListBullet"/>
       </w:pPr>
       <w:r>
-        <w:t>**CivicRecords AI v1.4.0** — public-records request management app. Uses</w:t>
+        <w:t>civiccore.audit - hash-chained audit primitives for tamper-evident local</w:t>
       </w:r>
     </w:p>
     <w:p>
       <w:r>
-        <w:t>civiccore v0.2.0 for LLM provider access, prompt templates, model</w:t>
-      </w:r>
-    </w:p>
-    <w:p>
-      <w:r>
-        <w:t>registry, and the shared migration baseline.</w:t>
-      </w:r>
-    </w:p>
-    <w:p>
-      <w:pPr>
-        <w:pStyle w:val="Heading3"/>
-      </w:pPr>
-      <w:r>
-        <w:t>Who will consume CivicCore next</w:t>
+        <w:t xml:space="preserve">  event streams.</w:t>
       </w:r>
     </w:p>
     <w:p>
@@ -302,7 +166,12 @@
         <w:pStyle w:val="ListBullet"/>
       </w:pPr>
       <w:r>
-        <w:t>**CivicClerk** — meeting management and agenda packets.</w:t>
+        <w:t>civiccore.provenance - source, citation, document, and provenance metadata</w:t>
+      </w:r>
+    </w:p>
+    <w:p>
+      <w:r>
+        <w:t xml:space="preserve">  contracts.</w:t>
       </w:r>
     </w:p>
     <w:p>
@@ -310,7 +179,7 @@
         <w:pStyle w:val="ListBullet"/>
       </w:pPr>
       <w:r>
-        <w:t>**CivicCode** — code enforcement.</w:t>
+        <w:t>civiccore.connectors - offline import/export manifest schemas.</w:t>
       </w:r>
     </w:p>
     <w:p>
@@ -318,103 +187,15 @@
         <w:pStyle w:val="ListBullet"/>
       </w:pPr>
       <w:r>
-        <w:t>**CivicZone** — zoning and permits.</w:t>
-      </w:r>
-    </w:p>
-    <w:p>
-      <w:r>
-        <w:t>These modules are on the CivicSuite roadmap; civiccore's API is designed so</w:t>
-      </w:r>
-    </w:p>
-    <w:p>
-      <w:r>
-        <w:t>they can plug in without civiccore changing shape.</w:t>
+        <w:t>civiccore.exports - static export-bundle manifest and checksum helpers.</w:t>
       </w:r>
     </w:p>
     <w:p>
       <w:pPr>
-        <w:pStyle w:val="Heading3"/>
+        <w:pStyle w:val="ListBullet"/>
       </w:pPr>
       <w:r>
-        <w:t>Why this exists</w:t>
-      </w:r>
-    </w:p>
-    <w:p>
-      <w:r>
-        <w:t>Three reasons:</w:t>
-      </w:r>
-    </w:p>
-    <w:p>
-      <w:r>
-        <w:t>1. **Sovereignty.** Cities can run the entire stack on their own</w:t>
-      </w:r>
-    </w:p>
-    <w:p>
-      <w:r>
-        <w:t>infrastructure (Ollama, local PostgreSQL) without vendor lock-in.</w:t>
-      </w:r>
-    </w:p>
-    <w:p>
-      <w:r>
-        <w:t>CivicCore's LLM abstraction makes the local-first deployment the default</w:t>
-      </w:r>
-    </w:p>
-    <w:p>
-      <w:r>
-        <w:t>path; cloud providers (OpenAI, Anthropic) are opt-in.</w:t>
-      </w:r>
-    </w:p>
-    <w:p>
-      <w:r>
-        <w:t>2. **Reuse without coupling.** Each CivicSuite module gets a stable,</w:t>
-      </w:r>
-    </w:p>
-    <w:p>
-      <w:r>
-        <w:t>versioned dependency surface — not a tangle of cross-imports.</w:t>
-      </w:r>
-    </w:p>
-    <w:p>
-      <w:r>
-        <w:t>3. **Audit and compliance.** Plumbing that touches resident data</w:t>
-      </w:r>
-    </w:p>
-    <w:p>
-      <w:r>
-        <w:t>(logging, sanitization, prompt-injection defense) lives in one place</w:t>
-      </w:r>
-    </w:p>
-    <w:p>
-      <w:r>
-        <w:t>where it can be reviewed and tested.</w:t>
-      </w:r>
-    </w:p>
-    <w:p>
-      <w:pPr>
-        <w:pStyle w:val="Heading3"/>
-      </w:pPr>
-      <w:r>
-        <w:t>Where CivicCore is in its lifecycle</w:t>
-      </w:r>
-    </w:p>
-    <w:p>
-      <w:r>
-        <w:t>Phase 2 has shipped. v0.2.0 is the second public release. There is no PyPI</w:t>
-      </w:r>
-    </w:p>
-    <w:p>
-      <w:r>
-        <w:t>release yet — civiccore is distributed as GitHub release wheels, signed</w:t>
-      </w:r>
-    </w:p>
-    <w:p>
-      <w:r>
-        <w:t>with SHA-256 checksums.</w:t>
-      </w:r>
-    </w:p>
-    <w:p>
-      <w:r>
-        <w:t>---</w:t>
+        <w:t>civiccore.cityprofile - local city/deployment configuration models.</w:t>
       </w:r>
     </w:p>
     <w:p>
@@ -422,148 +203,186 @@
         <w:pStyle w:val="Heading2"/>
       </w:pPr>
       <w:r>
-        <w:t>2. Technical guide for module developers and IT integrators</w:t>
+        <w:t>What v0.3.0 Does Not Ship Yet</w:t>
+      </w:r>
+    </w:p>
+    <w:p>
+      <w:r>
+        <w:t>The following namespaces remain planned extraction targets: civiccore.auth,</w:t>
+      </w:r>
+    </w:p>
+    <w:p>
+      <w:r>
+        <w:t>civiccore.catalog, civiccore.exemptions, civiccore.ingest,</w:t>
+      </w:r>
+    </w:p>
+    <w:p>
+      <w:r>
+        <w:t>civiccore.notifications, civiccore.onboarding, civiccore.scaffold,</w:t>
+      </w:r>
+    </w:p>
+    <w:p>
+      <w:r>
+        <w:t>civiccore.search, and civiccore.verification.</w:t>
+      </w:r>
+    </w:p>
+    <w:p>
+      <w:r>
+        <w:t>Live connector sync, credential storage, vendor write-back, document ingestion,</w:t>
+      </w:r>
+    </w:p>
+    <w:p>
+      <w:r>
+        <w:t>search indexing, notification delivery, auth/RBAC, and legal determinations are</w:t>
+      </w:r>
+    </w:p>
+    <w:p>
+      <w:r>
+        <w:t>also not shipped in v0.3.0. Downstream modules must not promote those behaviors</w:t>
+      </w:r>
+    </w:p>
+    <w:p>
+      <w:r>
+        <w:t>as shipped CivicCore capability.</w:t>
       </w:r>
     </w:p>
     <w:p>
       <w:pPr>
-        <w:pStyle w:val="Heading3"/>
+        <w:pStyle w:val="Heading2"/>
       </w:pPr>
       <w:r>
-        <w:t>Audience</w:t>
+        <w:t>Why Municipal Teams Should Care</w:t>
+      </w:r>
+    </w:p>
+    <w:p>
+      <w:pPr>
+        <w:pStyle w:val="ListBullet"/>
+      </w:pPr>
+      <w:r>
+        <w:t>Sovereignty: Local-first defaults keep cities in control of their data and</w:t>
       </w:r>
     </w:p>
     <w:p>
       <w:r>
-        <w:t>You are writing or operating a CivicSuite module (an app like records-ai),</w:t>
+        <w:t xml:space="preserve">  infrastructure.</w:t>
+      </w:r>
+    </w:p>
+    <w:p>
+      <w:pPr>
+        <w:pStyle w:val="ListBullet"/>
+      </w:pPr>
+      <w:r>
+        <w:t>Reuse without coupling: Each CivicSuite module depends on the same</w:t>
       </w:r>
     </w:p>
     <w:p>
       <w:r>
-        <w:t>or you are an IT integrator standing one up for a city. You need to install</w:t>
+        <w:t xml:space="preserve">  versioned primitives rather than copying logic.</w:t>
+      </w:r>
+    </w:p>
+    <w:p>
+      <w:pPr>
+        <w:pStyle w:val="ListBullet"/>
+      </w:pPr>
+      <w:r>
+        <w:t>Auditability: Shared contracts for provenance, export bundles, and audit</w:t>
       </w:r>
     </w:p>
     <w:p>
       <w:r>
-        <w:t>civiccore as a dependency, consume its public API, and run its migrations.</w:t>
+        <w:t xml:space="preserve">  chains make compliance evidence more consistent across modules.</w:t>
+      </w:r>
+    </w:p>
+    <w:p/>
+    <w:p>
+      <w:pPr>
+        <w:pStyle w:val="Heading1"/>
+      </w:pPr>
+      <w:r>
+        <w:t>2. Technical Guide for IT and Module Developers</w:t>
       </w:r>
     </w:p>
     <w:p>
       <w:pPr>
-        <w:pStyle w:val="Heading3"/>
+        <w:pStyle w:val="Heading2"/>
       </w:pPr>
       <w:r>
-        <w:t>Install (from a release wheel)</w:t>
+        <w:t>Install from a Release Wheel</w:t>
       </w:r>
     </w:p>
     <w:p>
       <w:r>
-        <w:t>CivicCore is distributed as versioned GitHub release wheels — **not on</w:t>
+        <w:t>CivicCore is distributed as GitHub release artifacts, not PyPI packages:</w:t>
       </w:r>
     </w:p>
     <w:p>
       <w:r>
-        <w:t>PyPI**. Pin the exact wheel URL in your downstream project:</w:t>
+        <w:rPr>
+          <w:rFonts w:ascii="Consolas" w:hAnsi="Consolas"/>
+        </w:rPr>
+        <w:t>pip install https://github.com/CivicSuite/civiccore/releases/download/v0.3.0/civiccore-0.3.0-py3-none-any.whl</w:t>
       </w:r>
     </w:p>
     <w:p>
       <w:r>
-        <w:t>pip install https://github.com/CivicSuite/civiccore/releases/download/v0.2.0/civiccore-0.2.0-py3-none-any.whl</w:t>
+        <w:t>Each release publishes SHA256SUMS.txt next to the wheel and source</w:t>
       </w:r>
     </w:p>
     <w:p>
       <w:r>
-        <w:t>Each release publishes `SHA256SUMS.txt` alongside the wheel and sdist:</w:t>
+        <w:t>distribution. Verify checksums before promoting a release artifact:</w:t>
       </w:r>
     </w:p>
     <w:p>
       <w:r>
+        <w:rPr>
+          <w:rFonts w:ascii="Consolas" w:hAnsi="Consolas"/>
+        </w:rPr>
         <w:t>curl -L -o SHA256SUMS.txt \</w:t>
-      </w:r>
-    </w:p>
-    <w:p>
-      <w:r>
-        <w:t>https://github.com/CivicSuite/civiccore/releases/download/v0.2.0/SHA256SUMS.txt</w:t>
-      </w:r>
-    </w:p>
-    <w:p>
-      <w:r>
+        <w:br/>
+        <w:t xml:space="preserve">  https://github.com/CivicSuite/civiccore/releases/download/v0.3.0/SHA256SUMS.txt</w:t>
+        <w:br/>
         <w:t>sha256sum -c SHA256SUMS.txt</w:t>
       </w:r>
     </w:p>
     <w:p>
       <w:r>
-        <w:t>Always verify the checksum before promoting an artifact into a downstream</w:t>
-      </w:r>
-    </w:p>
-    <w:p>
-      <w:r>
-        <w:t>module or an internal package mirror.</w:t>
-      </w:r>
-    </w:p>
-    <w:p>
-      <w:pPr>
-        <w:pStyle w:val="Heading3"/>
-      </w:pPr>
-      <w:r>
-        <w:t>Optional cloud-provider SDKs</w:t>
-      </w:r>
-    </w:p>
-    <w:p>
-      <w:r>
-        <w:t>The Ollama provider is built in and uses `httpx` (already a base dependency).</w:t>
-      </w:r>
-    </w:p>
-    <w:p>
-      <w:r>
-        <w:t>OpenAI and Anthropic providers require their respective SDKs and are</w:t>
-      </w:r>
-    </w:p>
-    <w:p>
-      <w:r>
-        <w:t>installed only if you intend to use them:</w:t>
-      </w:r>
-    </w:p>
-    <w:p>
-      <w:r>
-        <w:t>pip install openai      # only if instantiating OpenAIProvider</w:t>
-      </w:r>
-    </w:p>
-    <w:p>
-      <w:r>
-        <w:t>pip install anthropic   # only if instantiating AnthropicProvider</w:t>
-      </w:r>
-    </w:p>
-    <w:p>
-      <w:pPr>
-        <w:pStyle w:val="Heading3"/>
-      </w:pPr>
-      <w:r>
-        <w:t>Consuming the LLM provider abstraction</w:t>
+        <w:t>For local development:</w:t>
       </w:r>
     </w:p>
     <w:p>
       <w:r>
         <w:rPr>
-          <w:rFonts w:ascii="Courier New" w:hAnsi="Courier New"/>
-          <w:sz w:val="18"/>
+          <w:rFonts w:ascii="Consolas" w:hAnsi="Consolas"/>
         </w:rPr>
-        <w:t>from civiccore.llm import (</w:t>
+        <w:t>git clone https://github.com/CivicSuite/civiccore.git</w:t>
         <w:br/>
-        <w:t xml:space="preserve">    get_provider,</w:t>
+        <w:t>cd civiccore</w:t>
         <w:br/>
-        <w:t xml:space="preserve">    register_provider,</w:t>
-        <w:br/>
-        <w:t xml:space="preserve">    LLMProvider,</w:t>
-        <w:br/>
-        <w:t>)</w:t>
+        <w:t>pip install -e .[dev]</w:t>
+      </w:r>
+    </w:p>
+    <w:p>
+      <w:pPr>
+        <w:pStyle w:val="Heading2"/>
+      </w:pPr>
+      <w:r>
+        <w:t>Use LLM Providers</w:t>
+      </w:r>
+    </w:p>
+    <w:p>
+      <w:r>
+        <w:rPr>
+          <w:rFonts w:ascii="Consolas" w:hAnsi="Consolas"/>
+        </w:rPr>
+        <w:t>from civiccore.llm import get_provider</w:t>
         <w:br/>
         <w:br/>
         <w:t>provider = get_provider("ollama", base_url="http://localhost:11434")</w:t>
         <w:br/>
         <w:t>text = await provider.generate(</w:t>
         <w:br/>
-        <w:t xml:space="preserve">    system_prompt="You summarize public-records requests.",</w:t>
+        <w:t xml:space="preserve">    system_prompt="You summarize municipal records.",</w:t>
         <w:br/>
         <w:t xml:space="preserve">    user_content="Summarize this request: ...",</w:t>
         <w:br/>
@@ -572,51 +391,39 @@
     </w:p>
     <w:p>
       <w:r>
-        <w:t>Register a custom provider without modifying civiccore source:</w:t>
+        <w:t>Ollama uses the base dependency set. OpenAI and Anthropic require their SDKs</w:t>
+      </w:r>
+    </w:p>
+    <w:p>
+      <w:r>
+        <w:t>only if those providers are instantiated:</w:t>
       </w:r>
     </w:p>
     <w:p>
       <w:r>
         <w:rPr>
-          <w:rFonts w:ascii="Courier New" w:hAnsi="Courier New"/>
-          <w:sz w:val="18"/>
+          <w:rFonts w:ascii="Consolas" w:hAnsi="Consolas"/>
         </w:rPr>
-        <w:t>from civiccore.llm import LLMProvider, register_provider</w:t>
+        <w:t>pip install openai</w:t>
         <w:br/>
-        <w:br/>
-        <w:t>@register_provider("my_provider")</w:t>
-        <w:br/>
-        <w:t>class MyProvider(LLMProvider):</w:t>
-        <w:br/>
-        <w:t xml:space="preserve">    async def generate(self, *, system_prompt, user_content, **kwargs):</w:t>
-        <w:br/>
-        <w:t xml:space="preserve">        ...</w:t>
+        <w:t>pip install anthropic</w:t>
       </w:r>
     </w:p>
     <w:p>
       <w:pPr>
-        <w:pStyle w:val="Heading3"/>
+        <w:pStyle w:val="Heading2"/>
       </w:pPr>
       <w:r>
-        <w:t>Consuming the prompt template engine</w:t>
+        <w:t>Use Prompt Templates</w:t>
       </w:r>
     </w:p>
     <w:p>
       <w:r>
         <w:rPr>
-          <w:rFonts w:ascii="Courier New" w:hAnsi="Courier New"/>
-          <w:sz w:val="18"/>
+          <w:rFonts w:ascii="Consolas" w:hAnsi="Consolas"/>
         </w:rPr>
-        <w:t>from civiccore.llm import (</w:t>
+        <w:t>from civiccore.llm import render_template, resolve_template</w:t>
         <w:br/>
-        <w:t xml:space="preserve">    resolve_template,</w:t>
-        <w:br/>
-        <w:t xml:space="preserve">    render_template,</w:t>
-        <w:br/>
-        <w:t>)</w:t>
-        <w:br/>
-        <w:br/>
-        <w:t># 3-step resolver: app DB override → code-level override → civiccore default</w:t>
         <w:br/>
         <w:t>template = await resolve_template(</w:t>
         <w:br/>
@@ -628,138 +435,288 @@
         <w:br/>
         <w:t>)</w:t>
         <w:br/>
-        <w:t>rendered = render_template(template, {"document_text": doc})</w:t>
+        <w:t>rendered = render_template(template, {"document_text": document_text})</w:t>
       </w:r>
     </w:p>
     <w:p>
       <w:r>
-        <w:t>The 3-step resolver lets operators hot-fix a prompt in production via the</w:t>
+        <w:t>The resolver checks app DB overrides first, code-level overrides second, and</w:t>
       </w:r>
     </w:p>
     <w:p>
       <w:r>
-        <w:t>DB without re-deploying code, while preserving a code-level override for</w:t>
-      </w:r>
-    </w:p>
-    <w:p>
-      <w:r>
-        <w:t>deterministic test environments and a civiccore default as a safe fallback.</w:t>
+        <w:t>CivicCore defaults third. Missing variables produce actionable render errors.</w:t>
       </w:r>
     </w:p>
     <w:p>
       <w:pPr>
-        <w:pStyle w:val="Heading3"/>
+        <w:pStyle w:val="Heading2"/>
       </w:pPr>
       <w:r>
-        <w:t>Consuming the model registry</w:t>
+        <w:t>Use Audit, Provenance, Manifest, Export, and City Profile Primitives</w:t>
       </w:r>
     </w:p>
     <w:p>
       <w:r>
         <w:rPr>
-          <w:rFonts w:ascii="Courier New" w:hAnsi="Courier New"/>
-          <w:sz w:val="18"/>
+          <w:rFonts w:ascii="Consolas" w:hAnsi="Consolas"/>
         </w:rPr>
-        <w:t>from civiccore.llm import (</w:t>
+        <w:t>from civiccore import (</w:t>
         <w:br/>
-        <w:t xml:space="preserve">    get_active_model,</w:t>
+        <w:t xml:space="preserve">    AuditActor,</w:t>
         <w:br/>
-        <w:t xml:space="preserve">    require_active_model,</w:t>
+        <w:t xml:space="preserve">    AuditHashChain,</w:t>
         <w:br/>
-        <w:t xml:space="preserve">    model_registry_router,</w:t>
+        <w:t xml:space="preserve">    AuditSubject,</w:t>
+        <w:br/>
+        <w:t xml:space="preserve">    CityProfile,</w:t>
+        <w:br/>
+        <w:t xml:space="preserve">    ExportBundle,</w:t>
+        <w:br/>
+        <w:t xml:space="preserve">    ImportManifest,</w:t>
+        <w:br/>
+        <w:t xml:space="preserve">    SourceReference,</w:t>
+        <w:br/>
+        <w:t xml:space="preserve">    validate_bundle,</w:t>
+        <w:br/>
+        <w:t xml:space="preserve">    validate_manifest,</w:t>
         <w:br/>
         <w:t>)</w:t>
         <w:br/>
-        <w:t>from fastapi import FastAPI</w:t>
         <w:br/>
+        <w:t>chain = AuditHashChain()</w:t>
         <w:br/>
-        <w:t>app = FastAPI()</w:t>
+        <w:t>chain.record_event(</w:t>
         <w:br/>
-        <w:t>app.include_router(model_registry_router, prefix="/admin/models")</w:t>
+        <w:t xml:space="preserve">    actor=AuditActor(actor_id="clerk-1", actor_type="staff"),</w:t>
         <w:br/>
+        <w:t xml:space="preserve">    action="packet_exported",</w:t>
         <w:br/>
-        <w:t>active = await require_active_model(session, role="extraction")</w:t>
+        <w:t xml:space="preserve">    subject=AuditSubject(subject_id="meeting-42", subject_type="meeting"),</w:t>
+        <w:br/>
+        <w:t xml:space="preserve">    source_module="civicclerk",</w:t>
+        <w:br/>
+        <w:t>)</w:t>
+        <w:br/>
+        <w:t>assert chain.verify()</w:t>
+      </w:r>
+    </w:p>
+    <w:p>
+      <w:r>
+        <w:t>These primitives are storage-neutral. They give downstream modules a consistent</w:t>
+      </w:r>
+    </w:p>
+    <w:p>
+      <w:r>
+        <w:t>contract without dictating where records are stored.</w:t>
       </w:r>
     </w:p>
     <w:p>
       <w:pPr>
-        <w:pStyle w:val="Heading3"/>
+        <w:pStyle w:val="Heading2"/>
       </w:pPr>
       <w:r>
-        <w:t>Running civiccore migrations from a downstream alembic chain</w:t>
+        <w:t>Run Migrations from a Consumer</w:t>
       </w:r>
     </w:p>
     <w:p>
       <w:r>
-        <w:t>CivicCore ships a baseline migration `civiccore_0001_baseline_v1` that</w:t>
+        <w:t>CivicCore migrations run before a downstream module's migrations. Consumer</w:t>
       </w:r>
     </w:p>
     <w:p>
       <w:r>
-        <w:t>creates the shared schema (prompt_templates, model_registry, llm_audit</w:t>
+        <w:t>modules use CivicCore's migration runner and keep their own version table so</w:t>
       </w:r>
     </w:p>
     <w:p>
       <w:r>
-        <w:t>tables, etc.). Downstream consumers run civiccore's migrations as part of</w:t>
+        <w:t>revision names do not collide.</w:t>
       </w:r>
     </w:p>
     <w:p>
       <w:r>
-        <w:t>their own alembic chain by depending on civiccore's version table.</w:t>
+        <w:t>The release gate verifies the CivicCore migration chain, including</w:t>
       </w:r>
     </w:p>
     <w:p>
       <w:r>
-        <w:t>Pattern:</w:t>
+        <w:t>civiccore0001baselinev1 and civiccore0002llm.</w:t>
+      </w:r>
+    </w:p>
+    <w:p/>
+    <w:p>
+      <w:pPr>
+        <w:pStyle w:val="Heading1"/>
+      </w:pPr>
+      <w:r>
+        <w:t>3. Architecture Reference</w:t>
+      </w:r>
+    </w:p>
+    <w:p>
+      <w:pPr>
+        <w:pStyle w:val="Heading2"/>
+      </w:pPr>
+      <w:r>
+        <w:t>Shipped vs Planned</w:t>
       </w:r>
     </w:p>
     <w:p>
       <w:r>
-        <w:t># In your downstream module's alembic env.py:</w:t>
+        <w:t>Diagram: CivicCore shipped vs planned namespaces (see docs/diagrams/civiccore-extraction-map.svg).</w:t>
       </w:r>
     </w:p>
     <w:p>
       <w:r>
-        <w:t>from civiccore.migrations import include_civiccore_migrations</w:t>
+        <w:t>Shipped implementation in v0.3.0:</w:t>
       </w:r>
     </w:p>
     <w:p>
       <w:r>
-        <w:t>include_civiccore_migrations(context)</w:t>
+        <w:rPr>
+          <w:rFonts w:ascii="Consolas" w:hAnsi="Consolas"/>
+        </w:rPr>
+        <w:t>civiccore/</w:t>
+        <w:br/>
+        <w:t xml:space="preserve">  audit/        hash-chained audit primitives</w:t>
+        <w:br/>
+        <w:t xml:space="preserve">  city_profile/ local city/deployment configuration models</w:t>
+        <w:br/>
+        <w:t xml:space="preserve">  connectors/   offline import/export manifest schemas</w:t>
+        <w:br/>
+        <w:t xml:space="preserve">  db/           shared SQLAlchemy declarative Base</w:t>
+        <w:br/>
+        <w:t xml:space="preserve">  exports/      static export-bundle helpers</w:t>
+        <w:br/>
+        <w:t xml:space="preserve">  llm/          providers, templates, registry, context, structured output</w:t>
+        <w:br/>
+        <w:t xml:space="preserve">  migrations/   migration runner and shared schema baseline</w:t>
+        <w:br/>
+        <w:t xml:space="preserve">  provenance/   source/citation/provenance metadata contracts</w:t>
       </w:r>
     </w:p>
     <w:p>
       <w:r>
-        <w:t># Then your module's revisions can list civiccore_0001_baseline_v1 as</w:t>
+        <w:t>Planned namespaces in v0.3.0:</w:t>
       </w:r>
     </w:p>
     <w:p>
       <w:r>
-        <w:t># a `down_revision` dependency, ensuring civiccore's tables exist</w:t>
+        <w:rPr>
+          <w:rFonts w:ascii="Consolas" w:hAnsi="Consolas"/>
+        </w:rPr>
+        <w:t>civiccore/</w:t>
+        <w:br/>
+        <w:t xml:space="preserve">  auth/          future auth/RBAC extraction</w:t>
+        <w:br/>
+        <w:t xml:space="preserve">  catalog/       future catalog primitives</w:t>
+        <w:br/>
+        <w:t xml:space="preserve">  exemptions/    future 50-state public-records exemption engine</w:t>
+        <w:br/>
+        <w:t xml:space="preserve">  ingest/        future document ingestion</w:t>
+        <w:br/>
+        <w:t xml:space="preserve">  notifications/ future notification primitives</w:t>
+        <w:br/>
+        <w:t xml:space="preserve">  onboarding/    future web onboarding flows</w:t>
+        <w:br/>
+        <w:t xml:space="preserve">  scaffold/      future scaffolding helpers</w:t>
+        <w:br/>
+        <w:t xml:space="preserve">  search/        future hybrid search</w:t>
+        <w:br/>
+        <w:t xml:space="preserve">  verification/  future sovereignty verification</w:t>
+      </w:r>
+    </w:p>
+    <w:p>
+      <w:pPr>
+        <w:pStyle w:val="Heading2"/>
+      </w:pPr>
+      <w:r>
+        <w:t>Migration Order</w:t>
       </w:r>
     </w:p>
     <w:p>
       <w:r>
-        <w:t># before your module's tables reference them.</w:t>
+        <w:t>Diagram: Migration order (see docs/diagrams/migration-order.svg).</w:t>
       </w:r>
     </w:p>
     <w:p>
       <w:r>
-        <w:t>For the canonical pattern, look at `civicrecords-ai`'s `alembic/env.py` —</w:t>
+        <w:t>Consumer applications run CivicCore migrations first, then their own module</w:t>
       </w:r>
     </w:p>
     <w:p>
       <w:r>
-        <w:t>it is the reference integration.</w:t>
+        <w:t>migrations. Separate Alembic version tables prevent revision-name collisions.</w:t>
       </w:r>
     </w:p>
     <w:p>
       <w:pPr>
-        <w:pStyle w:val="Heading3"/>
+        <w:pStyle w:val="Heading2"/>
       </w:pPr>
       <w:r>
-        <w:t>Operating notes</w:t>
+        <w:t>LLM Provider Abstraction</w:t>
+      </w:r>
+    </w:p>
+    <w:p>
+      <w:r>
+        <w:t>Diagram: Provider abstraction (see docs/diagrams/provider-abstraction.svg).</w:t>
+      </w:r>
+    </w:p>
+    <w:p>
+      <w:r>
+        <w:t>The provider abstraction keeps local Ollama as the sovereignty-first default</w:t>
+      </w:r>
+    </w:p>
+    <w:p>
+      <w:r>
+        <w:t>while allowing explicitly configured cloud providers where a city authorizes</w:t>
+      </w:r>
+    </w:p>
+    <w:p>
+      <w:r>
+        <w:t>them.</w:t>
+      </w:r>
+    </w:p>
+    <w:p>
+      <w:pPr>
+        <w:pStyle w:val="Heading2"/>
+      </w:pPr>
+      <w:r>
+        <w:t>Compatibility</w:t>
+      </w:r>
+    </w:p>
+    <w:p>
+      <w:r>
+        <w:t>Current v0.1.0 module foundations still pin civiccore==0.2.0.</w:t>
+      </w:r>
+    </w:p>
+    <w:p>
+      <w:r>
+        <w:t>Production-depth consumers can move to civiccore==0.3.0 after this release</w:t>
+      </w:r>
+    </w:p>
+    <w:p>
+      <w:r>
+        <w:t>and the suite compatibility matrix are updated.</w:t>
+      </w:r>
+    </w:p>
+    <w:p>
+      <w:r>
+        <w:t>The suite-wide matrix lives at:</w:t>
+      </w:r>
+    </w:p>
+    <w:p>
+      <w:r>
+        <w:t>https://github.com/CivicSuite/civicsuite/tree/main/docs/compatibility</w:t>
+      </w:r>
+    </w:p>
+    <w:p/>
+    <w:p>
+      <w:pPr>
+        <w:pStyle w:val="Heading1"/>
+      </w:pPr>
+      <w:r>
+        <w:t>Appendix: Where to File Issues</w:t>
       </w:r>
     </w:p>
     <w:p>
@@ -767,7 +724,7 @@
         <w:pStyle w:val="ListBullet"/>
       </w:pPr>
       <w:r>
-        <w:t>**Idempotent.** Migration application is idempotent; safe to re-run.</w:t>
+        <w:t>CivicCore bug: https://github.com/CivicSuite/civiccore/issues</w:t>
       </w:r>
     </w:p>
     <w:p>
@@ -775,12 +732,7 @@
         <w:pStyle w:val="ListBullet"/>
       </w:pPr>
       <w:r>
-        <w:t>**No network at import time.** Importing `civiccore.llm` does not make</w:t>
-      </w:r>
-    </w:p>
-    <w:p>
-      <w:r>
-        <w:t>any LLM calls. Provider construction is the first network event.</w:t>
+        <w:t>Suite-wide design issue: https://github.com/CivicSuite/civicsuite/issues</w:t>
       </w:r>
     </w:p>
     <w:p>
@@ -788,599 +740,17 @@
         <w:pStyle w:val="ListBullet"/>
       </w:pPr>
       <w:r>
-        <w:t>**No cost tracking.** Per ADR-0004, civiccore does not track LLM spend.</w:t>
+        <w:t>Security issue: follow SECURITY.md; do not file publicly.</w:t>
       </w:r>
     </w:p>
     <w:p>
       <w:r>
-        <w:t>Token counting in `civiccore.llm` is for context-window math only.</w:t>
-      </w:r>
-    </w:p>
-    <w:p>
-      <w:pPr>
-        <w:pStyle w:val="ListBullet"/>
-      </w:pPr>
-      <w:r>
-        <w:t>**Sovereignty default.** Ollama is the default provider in the registry.</w:t>
-      </w:r>
-    </w:p>
-    <w:p>
-      <w:r>
-        <w:t>OpenAI and Anthropic must be explicitly enabled by the operator.</w:t>
-      </w:r>
-    </w:p>
-    <w:p>
-      <w:r>
-        <w:t>---</w:t>
-      </w:r>
-    </w:p>
-    <w:p>
-      <w:pPr>
-        <w:pStyle w:val="Heading2"/>
-      </w:pPr>
-      <w:r>
-        <w:t>3. Architecture reference</w:t>
-      </w:r>
-    </w:p>
-    <w:p>
-      <w:pPr>
-        <w:pStyle w:val="Heading3"/>
-      </w:pPr>
-      <w:r>
-        <w:t>Submodules</w:t>
-      </w:r>
-    </w:p>
-    <w:p>
-      <w:r>
-        <w:t>Shipped (have implementation in v0.2.0):</w:t>
-      </w:r>
-    </w:p>
-    <w:p>
-      <w:r>
-        <w:rPr>
-          <w:rFonts w:ascii="Courier New" w:hAnsi="Courier New"/>
-          <w:sz w:val="18"/>
-        </w:rPr>
-        <w:t>civiccore/</w:t>
-        <w:br/>
-        <w:t>├── db/                  # Shared SQLAlchemy declarative Base</w:t>
-        <w:br/>
-        <w:t>├── migrations/          # Migration runner + civiccore_0001_baseline_v1</w:t>
-        <w:br/>
-        <w:t>│                        # + civiccore_0002_llm Phase 2 ALTER</w:t>
-        <w:br/>
-        <w:t>└── llm/                 # The civiccore.llm module (Phase 2)</w:t>
-        <w:br/>
-        <w:t xml:space="preserve">    ├── providers/       # LLMProvider ABC + Ollama / OpenAI / Anthropic</w:t>
-        <w:br/>
-        <w:t xml:space="preserve">    ├── factory.py       # build_provider() + CONFIG_SCHEMAS</w:t>
-        <w:br/>
-        <w:t xml:space="preserve">    ├── templates/       # PromptTemplate ORM + render + 3-step resolver</w:t>
-        <w:br/>
-        <w:t xml:space="preserve">    ├── registry/        # ModelRegistry ORM + service + admin router</w:t>
-        <w:br/>
-        <w:t xml:space="preserve">    ├── context.py       # TokenBudget, assemble_context, sanitize_for_llm</w:t>
-        <w:br/>
-        <w:t xml:space="preserve">    └── structured.py    # StructuredOutput (Pydantic-validated retry)</w:t>
-      </w:r>
-    </w:p>
-    <w:p>
-      <w:r>
-        <w:t>Planned (placeholder packages exist; implementation is future Phase work):</w:t>
-      </w:r>
-    </w:p>
-    <w:p>
-      <w:r>
-        <w:rPr>
-          <w:rFonts w:ascii="Courier New" w:hAnsi="Courier New"/>
-          <w:sz w:val="18"/>
-        </w:rPr>
-        <w:t>civiccore/</w:t>
-        <w:br/>
-        <w:t>├── audit/               # placeholder — future audit logging</w:t>
-        <w:br/>
-        <w:t>├── auth/                # placeholder — future authentication</w:t>
-        <w:br/>
-        <w:t>├── catalog/             # placeholder — future catalog primitives</w:t>
-        <w:br/>
-        <w:t>├── connectors/          # placeholder — future external connectors</w:t>
-        <w:br/>
-        <w:t>├── exemptions/          # placeholder — future 50-state exemption engine</w:t>
-        <w:br/>
-        <w:t>├── ingest/              # placeholder — future document ingestion</w:t>
-        <w:br/>
-        <w:t>├── notifications/       # placeholder — future notification primitives</w:t>
-        <w:br/>
-        <w:t>├── onboarding/          # placeholder — future onboarding flows</w:t>
-        <w:br/>
-        <w:t>├── scaffold/            # placeholder — future scaffolding helpers</w:t>
-        <w:br/>
-        <w:t>├── search/              # placeholder — future hybrid search</w:t>
-        <w:br/>
-        <w:t>└── verification/        # placeholder — future sovereignty verification</w:t>
-      </w:r>
-    </w:p>
-    <w:p>
-      <w:r>
-        <w:t>Each placeholder directory contains only an `__init__.py` docstring stub.</w:t>
-      </w:r>
-    </w:p>
-    <w:p>
-      <w:r>
-        <w:t>These namespaces are reserved import paths, not capability — do not</w:t>
-      </w:r>
-    </w:p>
-    <w:p>
-      <w:r>
-        <w:t>import from them in downstream code until they ship.</w:t>
-      </w:r>
-    </w:p>
-    <w:p>
-      <w:r>
-        <w:drawing>
-          <wp:inline xmlns:a="http://schemas.openxmlformats.org/drawingml/2006/main" xmlns:pic="http://schemas.openxmlformats.org/drawingml/2006/picture">
-            <wp:extent cx="5486400" cy="6660444"/>
-            <wp:docPr id="1" name="Picture 1"/>
-            <wp:cNvGraphicFramePr>
-              <a:graphicFrameLocks noChangeAspect="1"/>
-            </wp:cNvGraphicFramePr>
-            <a:graphic>
-              <a:graphicData uri="http://schemas.openxmlformats.org/drawingml/2006/picture">
-                <pic:pic>
-                  <pic:nvPicPr>
-                    <pic:cNvPr id="0" name="civiccore-extraction-map.png"/>
-                    <pic:cNvPicPr/>
-                  </pic:nvPicPr>
-                  <pic:blipFill>
-                    <a:blip r:embed="rId9"/>
-                    <a:stretch>
-                      <a:fillRect/>
-                    </a:stretch>
-                  </pic:blipFill>
-                  <pic:spPr>
-                    <a:xfrm>
-                      <a:off x="0" y="0"/>
-                      <a:ext cx="5486400" cy="6660444"/>
-                    </a:xfrm>
-                    <a:prstGeom prst="rect"/>
-                  </pic:spPr>
-                </pic:pic>
-              </a:graphicData>
-            </a:graphic>
-          </wp:inline>
-        </w:drawing>
-      </w:r>
-    </w:p>
-    <w:p>
-      <w:pPr>
-        <w:pStyle w:val="Heading3"/>
-      </w:pPr>
-      <w:r>
-        <w:t>How CivicCore fits with downstream consumers</w:t>
-      </w:r>
-    </w:p>
-    <w:p>
-      <w:r>
-        <w:rPr>
-          <w:rFonts w:ascii="Courier New" w:hAnsi="Courier New"/>
-          <w:sz w:val="18"/>
-        </w:rPr>
-        <w:t>+---------------------------------------------------------------+</w:t>
-        <w:br/>
-        <w:t>|                  Downstream consumer (e.g. records-ai)        |</w:t>
-        <w:br/>
-        <w:t>|                                                               |</w:t>
-        <w:br/>
-        <w:t>|   FastAPI app   alembic chain   business logic   UI           |</w:t>
-        <w:br/>
-        <w:t>|        |              |               |                       |</w:t>
-        <w:br/>
-        <w:t>+--------|--------------|---------------|-----------------------+</w:t>
-        <w:br/>
-        <w:t xml:space="preserve">         |              |               |</w:t>
-        <w:br/>
-        <w:t xml:space="preserve">         |              |               |  imports</w:t>
-        <w:br/>
-        <w:t xml:space="preserve">         v              v               v</w:t>
-        <w:br/>
-        <w:t>+---------------------------------------------------------------+</w:t>
-        <w:br/>
-        <w:t>|                       civiccore (library)                     |</w:t>
-        <w:br/>
-        <w:t>|                                                               |</w:t>
-        <w:br/>
-        <w:t>|   civiccore.llm                  civiccore.migrations         |</w:t>
-        <w:br/>
-        <w:t>|     - provider registry           - runner                    |</w:t>
-        <w:br/>
-        <w:t>|     - prompt templates            - civiccore_0001_baseline   |</w:t>
-        <w:br/>
-        <w:t>|     - model registry             civiccore.db                 |</w:t>
-        <w:br/>
-        <w:t>|     - context utils               - shared declarative Base   |</w:t>
-        <w:br/>
-        <w:t>|     - structured output                                       |</w:t>
-        <w:br/>
-        <w:t>|                                                               |</w:t>
-        <w:br/>
-        <w:t>+---------------------------------------------------------------+</w:t>
-        <w:br/>
-        <w:t xml:space="preserve">         |              |               |</w:t>
-        <w:br/>
-        <w:t xml:space="preserve">         v              v               v</w:t>
-        <w:br/>
-        <w:t>+---------------------------------------------------------------+</w:t>
-        <w:br/>
-        <w:t>|              External services (operator-controlled)          |</w:t>
-        <w:br/>
-        <w:t>|                                                               |</w:t>
-        <w:br/>
-        <w:t>|   Ollama (default)   PostgreSQL    OpenAI*    Anthropic*      |</w:t>
-        <w:br/>
-        <w:t>|                                                               |</w:t>
-        <w:br/>
-        <w:t>|   * opt-in; require explicit registry entry + SDK install     |</w:t>
-        <w:br/>
-        <w:t>+---------------------------------------------------------------+</w:t>
-      </w:r>
-    </w:p>
-    <w:p>
-      <w:pPr>
-        <w:pStyle w:val="Heading3"/>
-      </w:pPr>
-      <w:r>
-        <w:t>Migration ordering contract</w:t>
-      </w:r>
-    </w:p>
-    <w:p>
-      <w:r>
-        <w:t>CivicCore migrations are designed to run **before** any downstream</w:t>
-      </w:r>
-    </w:p>
-    <w:p>
-      <w:r>
-        <w:t>consumer's migrations. Downstream consumers reference civiccore's tables</w:t>
-      </w:r>
-    </w:p>
-    <w:p>
-      <w:r>
-        <w:t>in foreign keys and must list `civiccore_0001_baseline_v1` (or a later</w:t>
-      </w:r>
-    </w:p>
-    <w:p>
-      <w:r>
-        <w:t>civiccore revision) as a `down_revision`.</w:t>
-      </w:r>
-    </w:p>
-    <w:p>
-      <w:r>
-        <w:t>The migration runner uses idempotent guards — re-running a migration that</w:t>
-      </w:r>
-    </w:p>
-    <w:p>
-      <w:r>
-        <w:t>has already been applied is a no-op, not a failure.</w:t>
-      </w:r>
-    </w:p>
-    <w:p>
-      <w:r>
-        <w:drawing>
-          <wp:inline xmlns:a="http://schemas.openxmlformats.org/drawingml/2006/main" xmlns:pic="http://schemas.openxmlformats.org/drawingml/2006/picture">
-            <wp:extent cx="5486400" cy="3511296"/>
-            <wp:docPr id="2" name="Picture 2"/>
-            <wp:cNvGraphicFramePr>
-              <a:graphicFrameLocks noChangeAspect="1"/>
-            </wp:cNvGraphicFramePr>
-            <a:graphic>
-              <a:graphicData uri="http://schemas.openxmlformats.org/drawingml/2006/picture">
-                <pic:pic>
-                  <pic:nvPicPr>
-                    <pic:cNvPr id="0" name="migration-order.png"/>
-                    <pic:cNvPicPr/>
-                  </pic:nvPicPr>
-                  <pic:blipFill>
-                    <a:blip r:embed="rId10"/>
-                    <a:stretch>
-                      <a:fillRect/>
-                    </a:stretch>
-                  </pic:blipFill>
-                  <pic:spPr>
-                    <a:xfrm>
-                      <a:off x="0" y="0"/>
-                      <a:ext cx="5486400" cy="3511296"/>
-                    </a:xfrm>
-                    <a:prstGeom prst="rect"/>
-                  </pic:spPr>
-                </pic:pic>
-              </a:graphicData>
-            </a:graphic>
-          </wp:inline>
-        </w:drawing>
-      </w:r>
-    </w:p>
-    <w:p>
-      <w:pPr>
-        <w:pStyle w:val="Heading3"/>
-      </w:pPr>
-      <w:r>
-        <w:t>Provider abstraction</w:t>
-      </w:r>
-    </w:p>
-    <w:p>
-      <w:r>
-        <w:rPr>
-          <w:rFonts w:ascii="Courier New" w:hAnsi="Courier New"/>
-          <w:sz w:val="18"/>
-        </w:rPr>
-        <w:t>LLMProvider (ABC)</w:t>
-        <w:br/>
-        <w:t xml:space="preserve">   |</w:t>
-        <w:br/>
-        <w:t xml:space="preserve">   +-- OllamaProvider          (built-in, default; uses httpx)</w:t>
-        <w:br/>
-        <w:t xml:space="preserve">   +-- OpenAIProvider          (built-in; opt-in; pip install openai)</w:t>
-        <w:br/>
-        <w:t xml:space="preserve">   +-- AnthropicProvider       (built-in; opt-in; pip install anthropic)</w:t>
-        <w:br/>
-        <w:t xml:space="preserve">   +-- (third-party providers via @register_provider)</w:t>
-      </w:r>
-    </w:p>
-    <w:p>
-      <w:r>
-        <w:t>Construction goes through `build_provider(config)` (the factory) or</w:t>
-      </w:r>
-    </w:p>
-    <w:p>
-      <w:r>
-        <w:t>`get_provider(name, **kwargs)` (the registry shortcut). The ABC defines an</w:t>
-      </w:r>
-    </w:p>
-    <w:p>
-      <w:r>
-        <w:t>async `generate(system_prompt, user_content, **kwargs)` contract; concrete</w:t>
-      </w:r>
-    </w:p>
-    <w:p>
-      <w:r>
-        <w:t>providers implement transport, auth, and serialization details.</w:t>
-      </w:r>
-    </w:p>
-    <w:p>
-      <w:r>
-        <w:drawing>
-          <wp:inline xmlns:a="http://schemas.openxmlformats.org/drawingml/2006/main" xmlns:pic="http://schemas.openxmlformats.org/drawingml/2006/picture">
-            <wp:extent cx="5486400" cy="1717964"/>
-            <wp:docPr id="3" name="Picture 3"/>
-            <wp:cNvGraphicFramePr>
-              <a:graphicFrameLocks noChangeAspect="1"/>
-            </wp:cNvGraphicFramePr>
-            <a:graphic>
-              <a:graphicData uri="http://schemas.openxmlformats.org/drawingml/2006/picture">
-                <pic:pic>
-                  <pic:nvPicPr>
-                    <pic:cNvPr id="0" name="provider-abstraction.png"/>
-                    <pic:cNvPicPr/>
-                  </pic:nvPicPr>
-                  <pic:blipFill>
-                    <a:blip r:embed="rId11"/>
-                    <a:stretch>
-                      <a:fillRect/>
-                    </a:stretch>
-                  </pic:blipFill>
-                  <pic:spPr>
-                    <a:xfrm>
-                      <a:off x="0" y="0"/>
-                      <a:ext cx="5486400" cy="1717964"/>
-                    </a:xfrm>
-                    <a:prstGeom prst="rect"/>
-                  </pic:spPr>
-                </pic:pic>
-              </a:graphicData>
-            </a:graphic>
-          </wp:inline>
-        </w:drawing>
-      </w:r>
-    </w:p>
-    <w:p>
-      <w:pPr>
-        <w:pStyle w:val="Heading3"/>
-      </w:pPr>
-      <w:r>
-        <w:t>Prompt template 3-step resolver</w:t>
-      </w:r>
-    </w:p>
-    <w:p>
-      <w:r>
-        <w:rPr>
-          <w:rFonts w:ascii="Courier New" w:hAnsi="Courier New"/>
-          <w:sz w:val="18"/>
-        </w:rPr>
-        <w:t>resolve_template(session, name, consumer_app)</w:t>
-        <w:br/>
-        <w:br/>
-        <w:t xml:space="preserve">   1. App DB override</w:t>
-        <w:br/>
-        <w:t xml:space="preserve">        consumer_app=&lt;requesting app&gt;</w:t>
-        <w:br/>
-        <w:t xml:space="preserve">        is_override=True, is_active=True, highest version</w:t>
-        <w:br/>
-        <w:br/>
-        <w:t xml:space="preserve">   2. App code-level override</w:t>
-        <w:br/>
-        <w:t xml:space="preserve">        OVERRIDE_REGISTRY[(consumer_app, name)]</w:t>
-        <w:br/>
-        <w:t xml:space="preserve">        registered via register_template_override()</w:t>
-        <w:br/>
-        <w:br/>
-        <w:t xml:space="preserve">   3. CivicCore default</w:t>
-        <w:br/>
-        <w:t xml:space="preserve">        consumer_app="civiccore"</w:t>
-        <w:br/>
-        <w:t xml:space="preserve">        is_override=False, is_active=True, highest version</w:t>
-        <w:br/>
-        <w:br/>
-        <w:t xml:space="preserve">   else: PromptTemplateNotFoundError</w:t>
-      </w:r>
-    </w:p>
-    <w:p>
-      <w:r>
-        <w:t>DB overrides win over code overrides so operators retain production</w:t>
-      </w:r>
-    </w:p>
-    <w:p>
-      <w:r>
-        <w:t>hot-fix capability without a code deploy.</w:t>
-      </w:r>
-    </w:p>
-    <w:p>
-      <w:pPr>
-        <w:pStyle w:val="Heading3"/>
-      </w:pPr>
-      <w:r>
-        <w:t>Context utilities and structured output</w:t>
-      </w:r>
-    </w:p>
-    <w:p>
-      <w:r>
-        <w:t>`assemble_context()` packs system prompt + retrieved chunks into a</w:t>
-      </w:r>
-    </w:p>
-    <w:p>
-      <w:r>
-        <w:t>token-budgeted prompt, applying `sanitize_for_llm()` at chunk boundaries</w:t>
-      </w:r>
-    </w:p>
-    <w:p>
-      <w:r>
-        <w:t>to defuse prompt-injection attempts in retrieved content. `StructuredOutput`</w:t>
-      </w:r>
-    </w:p>
-    <w:p>
-      <w:r>
-        <w:t>wraps a provider call with a Pydantic schema; if the model returns</w:t>
-      </w:r>
-    </w:p>
-    <w:p>
-      <w:r>
-        <w:t>malformed JSON, it retries up to `max_attempts` times before raising</w:t>
-      </w:r>
-    </w:p>
-    <w:p>
-      <w:r>
-        <w:t>`StructuredOutputFailure`.</w:t>
-      </w:r>
-    </w:p>
-    <w:p>
-      <w:pPr>
-        <w:pStyle w:val="Heading3"/>
-      </w:pPr>
-      <w:r>
-        <w:t>Sovereignty and ADR-0004</w:t>
-      </w:r>
-    </w:p>
-    <w:p>
-      <w:pPr>
-        <w:pStyle w:val="ListBullet"/>
-      </w:pPr>
-      <w:r>
-        <w:t>No cost tracking, no spend limits in civiccore.</w:t>
-      </w:r>
-    </w:p>
-    <w:p>
-      <w:pPr>
-        <w:pStyle w:val="ListBullet"/>
-      </w:pPr>
-      <w:r>
-        <w:t>No telemetry; no phone-home.</w:t>
-      </w:r>
-    </w:p>
-    <w:p>
-      <w:pPr>
-        <w:pStyle w:val="ListBullet"/>
-      </w:pPr>
-      <w:r>
-        <w:t>Local-first default (Ollama).</w:t>
-      </w:r>
-    </w:p>
-    <w:p>
-      <w:pPr>
-        <w:pStyle w:val="ListBullet"/>
-      </w:pPr>
-      <w:r>
-        <w:t>Cloud providers are opt-in and require an explicit registry entry.</w:t>
-      </w:r>
-    </w:p>
-    <w:p>
-      <w:r>
-        <w:t>For the full design rationale see CivicCore Extraction Spec section 12 and</w:t>
-      </w:r>
-    </w:p>
-    <w:p>
-      <w:r>
-        <w:t>ADR-0004 in the civicsuite umbrella repo.</w:t>
-      </w:r>
-    </w:p>
-    <w:p>
-      <w:r>
-        <w:t>---</w:t>
-      </w:r>
-    </w:p>
-    <w:p>
-      <w:pPr>
-        <w:pStyle w:val="Heading2"/>
-      </w:pPr>
-      <w:r>
-        <w:t>Appendix: Where to file issues</w:t>
-      </w:r>
-    </w:p>
-    <w:p>
-      <w:pPr>
-        <w:pStyle w:val="ListBullet"/>
-      </w:pPr>
-      <w:r>
-        <w:t>**Bug in civiccore itself** — file at https://github.com/CivicSuite/civiccore/issues</w:t>
-      </w:r>
-    </w:p>
-    <w:p>
-      <w:pPr>
-        <w:pStyle w:val="ListBullet"/>
-      </w:pPr>
-      <w:r>
-        <w:t>**Bug that surfaces in records-ai but is caused by civiccore** — file at civiccore.</w:t>
-      </w:r>
-    </w:p>
-    <w:p>
-      <w:pPr>
-        <w:pStyle w:val="ListBullet"/>
-      </w:pPr>
-      <w:r>
-        <w:t>**Bug in records-ai** — file at https://github.com/CivicSuite/civicrecords-ai/issues</w:t>
-      </w:r>
-    </w:p>
-    <w:p>
-      <w:pPr>
-        <w:pStyle w:val="ListBullet"/>
-      </w:pPr>
-      <w:r>
-        <w:t>**Suite-wide design / cross-module question** — file at https://github.com/CivicSuite/civicsuite/issues</w:t>
-      </w:r>
-    </w:p>
-    <w:p>
-      <w:pPr>
-        <w:pStyle w:val="ListBullet"/>
-      </w:pPr>
-      <w:r>
-        <w:t>**Security vulnerability** — see SECURITY.md (do not file publicly).</w:t>
-      </w:r>
-    </w:p>
-    <w:p>
-      <w:r>
-        <w:t>The decision tree in CONTRIBUTING.md has the full rules.</w:t>
+        <w:t>The decision tree in CONTRIBUTING.md has the full routing rules.</w:t>
       </w:r>
     </w:p>
     <w:sectPr>
       <w:pgSz w:w="12240" w:h="15840"/>
-      <w:pgMar w:top="1440" w:right="1800" w:bottom="1440" w:left="1800" w:header="720" w:footer="720" w:gutter="0"/>
+      <w:pgMar w:top="1008" w:right="1080" w:bottom="1008" w:left="1080" w:header="720" w:footer="720" w:gutter="0"/>
       <w:cols w:space="720"/>
       <w:docGrid w:linePitch="360"/>
     </w:sectPr>

</xml_diff>

<commit_message>
feat: add civiccore v0.3 shared primitives (#14)
Co-authored-by: Scott Converse <scott@civicsuite.local>
</commit_message>
<xml_diff>
--- a/USER-MANUAL.docx
+++ b/USER-MANUAL.docx
@@ -4,7 +4,7 @@
   <w:body>
     <w:p>
       <w:pPr>
-        <w:pStyle w:val="Heading1"/>
+        <w:pStyle w:val="Title"/>
       </w:pPr>
       <w:r>
         <w:t>CivicCore User Manual</w:t>
@@ -12,7 +12,7 @@
     </w:p>
     <w:p>
       <w:r>
-        <w:t>Version: v0.2.0</w:t>
+        <w:t>Version: v0.3.0</w:t>
       </w:r>
     </w:p>
     <w:p>
@@ -27,57 +27,40 @@
     </w:p>
     <w:p>
       <w:r>
-        <w:t>This manual has three audiences. Read the section for your role.</w:t>
+        <w:t>This manual has three audiences:</w:t>
       </w:r>
     </w:p>
     <w:p>
+      <w:pPr>
+        <w:pStyle w:val="ListNumber"/>
+      </w:pPr>
       <w:r>
-        <w:t>1. **Non-technical overview for evaluators** — what civiccore is and why it</w:t>
+        <w:t>Non-technical evaluators - what CivicCore is and why it matters.</w:t>
       </w:r>
     </w:p>
     <w:p>
+      <w:pPr>
+        <w:pStyle w:val="ListNumber"/>
+      </w:pPr>
       <w:r>
-        <w:t>exists.</w:t>
+        <w:t>IT and module developers - how to install it and consume the public API.</w:t>
       </w:r>
     </w:p>
     <w:p>
+      <w:pPr>
+        <w:pStyle w:val="ListNumber"/>
+      </w:pPr>
       <w:r>
-        <w:t>2. **Technical guide for module developers and IT integrators** — install,</w:t>
+        <w:t>Architecture reviewers - what ships today, what is planned, and how the library fits into the CivicSuite stack.</w:t>
       </w:r>
     </w:p>
+    <w:p/>
     <w:p>
+      <w:pPr>
+        <w:pStyle w:val="Heading1"/>
+      </w:pPr>
       <w:r>
-        <w:t>consume the public API, run civiccore migrations from a downstream</w:t>
-      </w:r>
-    </w:p>
-    <w:p>
-      <w:r>
-        <w:t>alembic chain.</w:t>
-      </w:r>
-    </w:p>
-    <w:p>
-      <w:r>
-        <w:t>3. **Architecture reference** — shipped submodules (migration runner,</w:t>
-      </w:r>
-    </w:p>
-    <w:p>
-      <w:r>
-        <w:t>shared `Base`, LLM provider registry, prompt-template engine, model</w:t>
-      </w:r>
-    </w:p>
-    <w:p>
-      <w:r>
-        <w:t>registry, context utilities, structured output), the list of planned</w:t>
-      </w:r>
-    </w:p>
-    <w:p>
-      <w:r>
-        <w:t>placeholder namespaces, and a text diagram of how they fit together.</w:t>
-      </w:r>
-    </w:p>
-    <w:p>
-      <w:r>
-        <w:t>---</w:t>
+        <w:t>1. Non-Technical Overview</w:t>
       </w:r>
     </w:p>
     <w:p>
@@ -85,60 +68,50 @@
         <w:pStyle w:val="Heading2"/>
       </w:pPr>
       <w:r>
-        <w:t>1. Non-technical overview for evaluators</w:t>
+        <w:t>What CivicCore Is</w:t>
+      </w:r>
+    </w:p>
+    <w:p>
+      <w:r>
+        <w:t>CivicCore is the shared platform library underneath CivicSuite. It is the common</w:t>
+      </w:r>
+    </w:p>
+    <w:p>
+      <w:r>
+        <w:t>Python package that CivicSuite modules use for migrations, LLM plumbing,</w:t>
+      </w:r>
+    </w:p>
+    <w:p>
+      <w:r>
+        <w:t>provenance metadata, audit-chain primitives, export manifests, and local city</w:t>
+      </w:r>
+    </w:p>
+    <w:p>
+      <w:r>
+        <w:t>configuration.</w:t>
+      </w:r>
+    </w:p>
+    <w:p>
+      <w:r>
+        <w:t>It is not an app a clerk or resident logs into. End users interact with</w:t>
+      </w:r>
+    </w:p>
+    <w:p>
+      <w:r>
+        <w:t>module applications such as CivicRecords AI or CivicClerk. CivicCore is the</w:t>
+      </w:r>
+    </w:p>
+    <w:p>
+      <w:r>
+        <w:t>shared foundation those applications import.</w:t>
       </w:r>
     </w:p>
     <w:p>
       <w:pPr>
-        <w:pStyle w:val="Heading3"/>
+        <w:pStyle w:val="Heading2"/>
       </w:pPr>
       <w:r>
-        <w:t>What is CivicCore?</w:t>
-      </w:r>
-    </w:p>
-    <w:p>
-      <w:r>
-        <w:t>CivicCore is a **shared platform library** that sits underneath every product</w:t>
-      </w:r>
-    </w:p>
-    <w:p>
-      <w:r>
-        <w:t>in the CivicSuite family. The CivicSuite family is a set of open-source</w:t>
-      </w:r>
-    </w:p>
-    <w:p>
-      <w:r>
-        <w:t>municipal operations applications — the first one shipped is **CivicRecords AI**,</w:t>
-      </w:r>
-    </w:p>
-    <w:p>
-      <w:r>
-        <w:t>a public-records request management app for city governments. Future</w:t>
-      </w:r>
-    </w:p>
-    <w:p>
-      <w:r>
-        <w:t>modules (CivicClerk, CivicCode, CivicZone) will follow.</w:t>
-      </w:r>
-    </w:p>
-    <w:p>
-      <w:r>
-        <w:t>Rather than each of those apps re-inventing the same plumbing, CivicCore</w:t>
-      </w:r>
-    </w:p>
-    <w:p>
-      <w:r>
-        <w:t>provides one shared, audited, semver-stable implementation that each</w:t>
-      </w:r>
-    </w:p>
-    <w:p>
-      <w:r>
-        <w:t>module imports.</w:t>
-      </w:r>
-    </w:p>
-    <w:p>
-      <w:r>
-        <w:t>**What v0.2.0 actually ships:**</w:t>
+        <w:t>What v0.3.0 Ships</w:t>
       </w:r>
     </w:p>
     <w:p>
@@ -146,17 +119,12 @@
         <w:pStyle w:val="ListBullet"/>
       </w:pPr>
       <w:r>
-        <w:t>`civiccore.migrations` — migration runner with idempotent guards plus</w:t>
+        <w:t>civiccore.migrations - migration runner, idempotent guards, and the shared</w:t>
       </w:r>
     </w:p>
     <w:p>
       <w:r>
-        <w:t>the `civiccore_0001_baseline_v1` shared-schema baseline and the</w:t>
-      </w:r>
-    </w:p>
-    <w:p>
-      <w:r>
-        <w:t>`civiccore_0002_llm` Phase 2 ALTER.</w:t>
+        <w:t xml:space="preserve">  schema baseline.</w:t>
       </w:r>
     </w:p>
     <w:p>
@@ -164,7 +132,7 @@
         <w:pStyle w:val="ListBullet"/>
       </w:pPr>
       <w:r>
-        <w:t>`civiccore.db` — shared SQLAlchemy declarative `Base`.</w:t>
+        <w:t>civiccore.db - shared SQLAlchemy declarative Base.</w:t>
       </w:r>
     </w:p>
     <w:p>
@@ -172,103 +140,12 @@
         <w:pStyle w:val="ListBullet"/>
       </w:pPr>
       <w:r>
-        <w:t>`civiccore.llm` — LLM provider abstraction (Ollama / OpenAI /</w:t>
+        <w:t>civiccore.llm - provider registry, prompt templates, model registry,</w:t>
       </w:r>
     </w:p>
     <w:p>
       <w:r>
-        <w:t>Anthropic), prompt template engine with 3-step override resolver, model</w:t>
-      </w:r>
-    </w:p>
-    <w:p>
-      <w:r>
-        <w:t>registry service + admin router, context utilities with prompt-injection</w:t>
-      </w:r>
-    </w:p>
-    <w:p>
-      <w:r>
-        <w:t>defense, and Pydantic-validated structured output.</w:t>
-      </w:r>
-    </w:p>
-    <w:p>
-      <w:r>
-        <w:t>**Planned extraction targets (not yet implemented).** The following</w:t>
-      </w:r>
-    </w:p>
-    <w:p>
-      <w:r>
-        <w:t>namespaces have placeholder `__init__.py` files reserving the import path</w:t>
-      </w:r>
-    </w:p>
-    <w:p>
-      <w:r>
-        <w:t>but ship no implementation in v0.2.0: `civiccore.audit`, `civiccore.auth`,</w:t>
-      </w:r>
-    </w:p>
-    <w:p>
-      <w:r>
-        <w:t>`civiccore.catalog`, `civiccore.connectors`, `civiccore.exemptions`</w:t>
-      </w:r>
-    </w:p>
-    <w:p>
-      <w:r>
-        <w:t>(50-state public-records exemption engine), `civiccore.ingest` (document</w:t>
-      </w:r>
-    </w:p>
-    <w:p>
-      <w:r>
-        <w:t>ingestion), `civiccore.notifications`, `civiccore.onboarding`,</w:t>
-      </w:r>
-    </w:p>
-    <w:p>
-      <w:r>
-        <w:t>`civiccore.scaffold`, `civiccore.search` (hybrid search), and</w:t>
-      </w:r>
-    </w:p>
-    <w:p>
-      <w:r>
-        <w:t>`civiccore.verification` (sovereignty verification). These will land in</w:t>
-      </w:r>
-    </w:p>
-    <w:p>
-      <w:r>
-        <w:t>future Phase releases and must not be relied on by downstream modules</w:t>
-      </w:r>
-    </w:p>
-    <w:p>
-      <w:r>
-        <w:t>until they do.</w:t>
-      </w:r>
-    </w:p>
-    <w:p>
-      <w:pPr>
-        <w:pStyle w:val="Heading3"/>
-      </w:pPr>
-      <w:r>
-        <w:t>What CivicCore is not</w:t>
-      </w:r>
-    </w:p>
-    <w:p>
-      <w:r>
-        <w:t>CivicCore is **not** an end-user application. A city clerk does not "install</w:t>
-      </w:r>
-    </w:p>
-    <w:p>
-      <w:r>
-        <w:t>CivicCore." A resident does not "log in to CivicCore." CivicCore is a</w:t>
-      </w:r>
-    </w:p>
-    <w:p>
-      <w:r>
-        <w:t>library that the actual end-user apps depend on.</w:t>
-      </w:r>
-    </w:p>
-    <w:p>
-      <w:pPr>
-        <w:pStyle w:val="Heading3"/>
-      </w:pPr>
-      <w:r>
-        <w:t>Who consumes CivicCore today</w:t>
+        <w:t xml:space="preserve">  context utilities, and structured-output helpers.</w:t>
       </w:r>
     </w:p>
     <w:p>
@@ -276,25 +153,12 @@
         <w:pStyle w:val="ListBullet"/>
       </w:pPr>
       <w:r>
-        <w:t>**CivicRecords AI v1.4.0** — public-records request management app. Uses</w:t>
+        <w:t>civiccore.audit - hash-chained audit primitives for tamper-evident local</w:t>
       </w:r>
     </w:p>
     <w:p>
       <w:r>
-        <w:t>civiccore v0.2.0 for LLM provider access, prompt templates, model</w:t>
-      </w:r>
-    </w:p>
-    <w:p>
-      <w:r>
-        <w:t>registry, and the shared migration baseline.</w:t>
-      </w:r>
-    </w:p>
-    <w:p>
-      <w:pPr>
-        <w:pStyle w:val="Heading3"/>
-      </w:pPr>
-      <w:r>
-        <w:t>Who will consume CivicCore next</w:t>
+        <w:t xml:space="preserve">  event streams.</w:t>
       </w:r>
     </w:p>
     <w:p>
@@ -302,7 +166,12 @@
         <w:pStyle w:val="ListBullet"/>
       </w:pPr>
       <w:r>
-        <w:t>**CivicClerk** — meeting management and agenda packets.</w:t>
+        <w:t>civiccore.provenance - source, citation, document, and provenance metadata</w:t>
+      </w:r>
+    </w:p>
+    <w:p>
+      <w:r>
+        <w:t xml:space="preserve">  contracts.</w:t>
       </w:r>
     </w:p>
     <w:p>
@@ -310,7 +179,7 @@
         <w:pStyle w:val="ListBullet"/>
       </w:pPr>
       <w:r>
-        <w:t>**CivicCode** — code enforcement.</w:t>
+        <w:t>civiccore.connectors - offline import/export manifest schemas.</w:t>
       </w:r>
     </w:p>
     <w:p>
@@ -318,103 +187,15 @@
         <w:pStyle w:val="ListBullet"/>
       </w:pPr>
       <w:r>
-        <w:t>**CivicZone** — zoning and permits.</w:t>
-      </w:r>
-    </w:p>
-    <w:p>
-      <w:r>
-        <w:t>These modules are on the CivicSuite roadmap; civiccore's API is designed so</w:t>
-      </w:r>
-    </w:p>
-    <w:p>
-      <w:r>
-        <w:t>they can plug in without civiccore changing shape.</w:t>
+        <w:t>civiccore.exports - static export-bundle manifest and checksum helpers.</w:t>
       </w:r>
     </w:p>
     <w:p>
       <w:pPr>
-        <w:pStyle w:val="Heading3"/>
+        <w:pStyle w:val="ListBullet"/>
       </w:pPr>
       <w:r>
-        <w:t>Why this exists</w:t>
-      </w:r>
-    </w:p>
-    <w:p>
-      <w:r>
-        <w:t>Three reasons:</w:t>
-      </w:r>
-    </w:p>
-    <w:p>
-      <w:r>
-        <w:t>1. **Sovereignty.** Cities can run the entire stack on their own</w:t>
-      </w:r>
-    </w:p>
-    <w:p>
-      <w:r>
-        <w:t>infrastructure (Ollama, local PostgreSQL) without vendor lock-in.</w:t>
-      </w:r>
-    </w:p>
-    <w:p>
-      <w:r>
-        <w:t>CivicCore's LLM abstraction makes the local-first deployment the default</w:t>
-      </w:r>
-    </w:p>
-    <w:p>
-      <w:r>
-        <w:t>path; cloud providers (OpenAI, Anthropic) are opt-in.</w:t>
-      </w:r>
-    </w:p>
-    <w:p>
-      <w:r>
-        <w:t>2. **Reuse without coupling.** Each CivicSuite module gets a stable,</w:t>
-      </w:r>
-    </w:p>
-    <w:p>
-      <w:r>
-        <w:t>versioned dependency surface — not a tangle of cross-imports.</w:t>
-      </w:r>
-    </w:p>
-    <w:p>
-      <w:r>
-        <w:t>3. **Audit and compliance.** Plumbing that touches resident data</w:t>
-      </w:r>
-    </w:p>
-    <w:p>
-      <w:r>
-        <w:t>(logging, sanitization, prompt-injection defense) lives in one place</w:t>
-      </w:r>
-    </w:p>
-    <w:p>
-      <w:r>
-        <w:t>where it can be reviewed and tested.</w:t>
-      </w:r>
-    </w:p>
-    <w:p>
-      <w:pPr>
-        <w:pStyle w:val="Heading3"/>
-      </w:pPr>
-      <w:r>
-        <w:t>Where CivicCore is in its lifecycle</w:t>
-      </w:r>
-    </w:p>
-    <w:p>
-      <w:r>
-        <w:t>Phase 2 has shipped. v0.2.0 is the second public release. There is no PyPI</w:t>
-      </w:r>
-    </w:p>
-    <w:p>
-      <w:r>
-        <w:t>release yet — civiccore is distributed as GitHub release wheels, signed</w:t>
-      </w:r>
-    </w:p>
-    <w:p>
-      <w:r>
-        <w:t>with SHA-256 checksums.</w:t>
-      </w:r>
-    </w:p>
-    <w:p>
-      <w:r>
-        <w:t>---</w:t>
+        <w:t>civiccore.cityprofile - local city/deployment configuration models.</w:t>
       </w:r>
     </w:p>
     <w:p>
@@ -422,148 +203,186 @@
         <w:pStyle w:val="Heading2"/>
       </w:pPr>
       <w:r>
-        <w:t>2. Technical guide for module developers and IT integrators</w:t>
+        <w:t>What v0.3.0 Does Not Ship Yet</w:t>
+      </w:r>
+    </w:p>
+    <w:p>
+      <w:r>
+        <w:t>The following namespaces remain planned extraction targets: civiccore.auth,</w:t>
+      </w:r>
+    </w:p>
+    <w:p>
+      <w:r>
+        <w:t>civiccore.catalog, civiccore.exemptions, civiccore.ingest,</w:t>
+      </w:r>
+    </w:p>
+    <w:p>
+      <w:r>
+        <w:t>civiccore.notifications, civiccore.onboarding, civiccore.scaffold,</w:t>
+      </w:r>
+    </w:p>
+    <w:p>
+      <w:r>
+        <w:t>civiccore.search, and civiccore.verification.</w:t>
+      </w:r>
+    </w:p>
+    <w:p>
+      <w:r>
+        <w:t>Live connector sync, credential storage, vendor write-back, document ingestion,</w:t>
+      </w:r>
+    </w:p>
+    <w:p>
+      <w:r>
+        <w:t>search indexing, notification delivery, auth/RBAC, and legal determinations are</w:t>
+      </w:r>
+    </w:p>
+    <w:p>
+      <w:r>
+        <w:t>also not shipped in v0.3.0. Downstream modules must not promote those behaviors</w:t>
+      </w:r>
+    </w:p>
+    <w:p>
+      <w:r>
+        <w:t>as shipped CivicCore capability.</w:t>
       </w:r>
     </w:p>
     <w:p>
       <w:pPr>
-        <w:pStyle w:val="Heading3"/>
+        <w:pStyle w:val="Heading2"/>
       </w:pPr>
       <w:r>
-        <w:t>Audience</w:t>
+        <w:t>Why Municipal Teams Should Care</w:t>
+      </w:r>
+    </w:p>
+    <w:p>
+      <w:pPr>
+        <w:pStyle w:val="ListBullet"/>
+      </w:pPr>
+      <w:r>
+        <w:t>Sovereignty: Local-first defaults keep cities in control of their data and</w:t>
       </w:r>
     </w:p>
     <w:p>
       <w:r>
-        <w:t>You are writing or operating a CivicSuite module (an app like records-ai),</w:t>
+        <w:t xml:space="preserve">  infrastructure.</w:t>
+      </w:r>
+    </w:p>
+    <w:p>
+      <w:pPr>
+        <w:pStyle w:val="ListBullet"/>
+      </w:pPr>
+      <w:r>
+        <w:t>Reuse without coupling: Each CivicSuite module depends on the same</w:t>
       </w:r>
     </w:p>
     <w:p>
       <w:r>
-        <w:t>or you are an IT integrator standing one up for a city. You need to install</w:t>
+        <w:t xml:space="preserve">  versioned primitives rather than copying logic.</w:t>
+      </w:r>
+    </w:p>
+    <w:p>
+      <w:pPr>
+        <w:pStyle w:val="ListBullet"/>
+      </w:pPr>
+      <w:r>
+        <w:t>Auditability: Shared contracts for provenance, export bundles, and audit</w:t>
       </w:r>
     </w:p>
     <w:p>
       <w:r>
-        <w:t>civiccore as a dependency, consume its public API, and run its migrations.</w:t>
+        <w:t xml:space="preserve">  chains make compliance evidence more consistent across modules.</w:t>
+      </w:r>
+    </w:p>
+    <w:p/>
+    <w:p>
+      <w:pPr>
+        <w:pStyle w:val="Heading1"/>
+      </w:pPr>
+      <w:r>
+        <w:t>2. Technical Guide for IT and Module Developers</w:t>
       </w:r>
     </w:p>
     <w:p>
       <w:pPr>
-        <w:pStyle w:val="Heading3"/>
+        <w:pStyle w:val="Heading2"/>
       </w:pPr>
       <w:r>
-        <w:t>Install (from a release wheel)</w:t>
+        <w:t>Install from a Release Wheel</w:t>
       </w:r>
     </w:p>
     <w:p>
       <w:r>
-        <w:t>CivicCore is distributed as versioned GitHub release wheels — **not on</w:t>
+        <w:t>CivicCore is distributed as GitHub release artifacts, not PyPI packages:</w:t>
       </w:r>
     </w:p>
     <w:p>
       <w:r>
-        <w:t>PyPI**. Pin the exact wheel URL in your downstream project:</w:t>
+        <w:rPr>
+          <w:rFonts w:ascii="Consolas" w:hAnsi="Consolas"/>
+        </w:rPr>
+        <w:t>pip install https://github.com/CivicSuite/civiccore/releases/download/v0.3.0/civiccore-0.3.0-py3-none-any.whl</w:t>
       </w:r>
     </w:p>
     <w:p>
       <w:r>
-        <w:t>pip install https://github.com/CivicSuite/civiccore/releases/download/v0.2.0/civiccore-0.2.0-py3-none-any.whl</w:t>
+        <w:t>Each release publishes SHA256SUMS.txt next to the wheel and source</w:t>
       </w:r>
     </w:p>
     <w:p>
       <w:r>
-        <w:t>Each release publishes `SHA256SUMS.txt` alongside the wheel and sdist:</w:t>
+        <w:t>distribution. Verify checksums before promoting a release artifact:</w:t>
       </w:r>
     </w:p>
     <w:p>
       <w:r>
+        <w:rPr>
+          <w:rFonts w:ascii="Consolas" w:hAnsi="Consolas"/>
+        </w:rPr>
         <w:t>curl -L -o SHA256SUMS.txt \</w:t>
-      </w:r>
-    </w:p>
-    <w:p>
-      <w:r>
-        <w:t>https://github.com/CivicSuite/civiccore/releases/download/v0.2.0/SHA256SUMS.txt</w:t>
-      </w:r>
-    </w:p>
-    <w:p>
-      <w:r>
+        <w:br/>
+        <w:t xml:space="preserve">  https://github.com/CivicSuite/civiccore/releases/download/v0.3.0/SHA256SUMS.txt</w:t>
+        <w:br/>
         <w:t>sha256sum -c SHA256SUMS.txt</w:t>
       </w:r>
     </w:p>
     <w:p>
       <w:r>
-        <w:t>Always verify the checksum before promoting an artifact into a downstream</w:t>
-      </w:r>
-    </w:p>
-    <w:p>
-      <w:r>
-        <w:t>module or an internal package mirror.</w:t>
-      </w:r>
-    </w:p>
-    <w:p>
-      <w:pPr>
-        <w:pStyle w:val="Heading3"/>
-      </w:pPr>
-      <w:r>
-        <w:t>Optional cloud-provider SDKs</w:t>
-      </w:r>
-    </w:p>
-    <w:p>
-      <w:r>
-        <w:t>The Ollama provider is built in and uses `httpx` (already a base dependency).</w:t>
-      </w:r>
-    </w:p>
-    <w:p>
-      <w:r>
-        <w:t>OpenAI and Anthropic providers require their respective SDKs and are</w:t>
-      </w:r>
-    </w:p>
-    <w:p>
-      <w:r>
-        <w:t>installed only if you intend to use them:</w:t>
-      </w:r>
-    </w:p>
-    <w:p>
-      <w:r>
-        <w:t>pip install openai      # only if instantiating OpenAIProvider</w:t>
-      </w:r>
-    </w:p>
-    <w:p>
-      <w:r>
-        <w:t>pip install anthropic   # only if instantiating AnthropicProvider</w:t>
-      </w:r>
-    </w:p>
-    <w:p>
-      <w:pPr>
-        <w:pStyle w:val="Heading3"/>
-      </w:pPr>
-      <w:r>
-        <w:t>Consuming the LLM provider abstraction</w:t>
+        <w:t>For local development:</w:t>
       </w:r>
     </w:p>
     <w:p>
       <w:r>
         <w:rPr>
-          <w:rFonts w:ascii="Courier New" w:hAnsi="Courier New"/>
-          <w:sz w:val="18"/>
+          <w:rFonts w:ascii="Consolas" w:hAnsi="Consolas"/>
         </w:rPr>
-        <w:t>from civiccore.llm import (</w:t>
+        <w:t>git clone https://github.com/CivicSuite/civiccore.git</w:t>
         <w:br/>
-        <w:t xml:space="preserve">    get_provider,</w:t>
+        <w:t>cd civiccore</w:t>
         <w:br/>
-        <w:t xml:space="preserve">    register_provider,</w:t>
-        <w:br/>
-        <w:t xml:space="preserve">    LLMProvider,</w:t>
-        <w:br/>
-        <w:t>)</w:t>
+        <w:t>pip install -e .[dev]</w:t>
+      </w:r>
+    </w:p>
+    <w:p>
+      <w:pPr>
+        <w:pStyle w:val="Heading2"/>
+      </w:pPr>
+      <w:r>
+        <w:t>Use LLM Providers</w:t>
+      </w:r>
+    </w:p>
+    <w:p>
+      <w:r>
+        <w:rPr>
+          <w:rFonts w:ascii="Consolas" w:hAnsi="Consolas"/>
+        </w:rPr>
+        <w:t>from civiccore.llm import get_provider</w:t>
         <w:br/>
         <w:br/>
         <w:t>provider = get_provider("ollama", base_url="http://localhost:11434")</w:t>
         <w:br/>
         <w:t>text = await provider.generate(</w:t>
         <w:br/>
-        <w:t xml:space="preserve">    system_prompt="You summarize public-records requests.",</w:t>
+        <w:t xml:space="preserve">    system_prompt="You summarize municipal records.",</w:t>
         <w:br/>
         <w:t xml:space="preserve">    user_content="Summarize this request: ...",</w:t>
         <w:br/>
@@ -572,51 +391,39 @@
     </w:p>
     <w:p>
       <w:r>
-        <w:t>Register a custom provider without modifying civiccore source:</w:t>
+        <w:t>Ollama uses the base dependency set. OpenAI and Anthropic require their SDKs</w:t>
+      </w:r>
+    </w:p>
+    <w:p>
+      <w:r>
+        <w:t>only if those providers are instantiated:</w:t>
       </w:r>
     </w:p>
     <w:p>
       <w:r>
         <w:rPr>
-          <w:rFonts w:ascii="Courier New" w:hAnsi="Courier New"/>
-          <w:sz w:val="18"/>
+          <w:rFonts w:ascii="Consolas" w:hAnsi="Consolas"/>
         </w:rPr>
-        <w:t>from civiccore.llm import LLMProvider, register_provider</w:t>
+        <w:t>pip install openai</w:t>
         <w:br/>
-        <w:br/>
-        <w:t>@register_provider("my_provider")</w:t>
-        <w:br/>
-        <w:t>class MyProvider(LLMProvider):</w:t>
-        <w:br/>
-        <w:t xml:space="preserve">    async def generate(self, *, system_prompt, user_content, **kwargs):</w:t>
-        <w:br/>
-        <w:t xml:space="preserve">        ...</w:t>
+        <w:t>pip install anthropic</w:t>
       </w:r>
     </w:p>
     <w:p>
       <w:pPr>
-        <w:pStyle w:val="Heading3"/>
+        <w:pStyle w:val="Heading2"/>
       </w:pPr>
       <w:r>
-        <w:t>Consuming the prompt template engine</w:t>
+        <w:t>Use Prompt Templates</w:t>
       </w:r>
     </w:p>
     <w:p>
       <w:r>
         <w:rPr>
-          <w:rFonts w:ascii="Courier New" w:hAnsi="Courier New"/>
-          <w:sz w:val="18"/>
+          <w:rFonts w:ascii="Consolas" w:hAnsi="Consolas"/>
         </w:rPr>
-        <w:t>from civiccore.llm import (</w:t>
+        <w:t>from civiccore.llm import render_template, resolve_template</w:t>
         <w:br/>
-        <w:t xml:space="preserve">    resolve_template,</w:t>
-        <w:br/>
-        <w:t xml:space="preserve">    render_template,</w:t>
-        <w:br/>
-        <w:t>)</w:t>
-        <w:br/>
-        <w:br/>
-        <w:t># 3-step resolver: app DB override → code-level override → civiccore default</w:t>
         <w:br/>
         <w:t>template = await resolve_template(</w:t>
         <w:br/>
@@ -628,138 +435,288 @@
         <w:br/>
         <w:t>)</w:t>
         <w:br/>
-        <w:t>rendered = render_template(template, {"document_text": doc})</w:t>
+        <w:t>rendered = render_template(template, {"document_text": document_text})</w:t>
       </w:r>
     </w:p>
     <w:p>
       <w:r>
-        <w:t>The 3-step resolver lets operators hot-fix a prompt in production via the</w:t>
+        <w:t>The resolver checks app DB overrides first, code-level overrides second, and</w:t>
       </w:r>
     </w:p>
     <w:p>
       <w:r>
-        <w:t>DB without re-deploying code, while preserving a code-level override for</w:t>
-      </w:r>
-    </w:p>
-    <w:p>
-      <w:r>
-        <w:t>deterministic test environments and a civiccore default as a safe fallback.</w:t>
+        <w:t>CivicCore defaults third. Missing variables produce actionable render errors.</w:t>
       </w:r>
     </w:p>
     <w:p>
       <w:pPr>
-        <w:pStyle w:val="Heading3"/>
+        <w:pStyle w:val="Heading2"/>
       </w:pPr>
       <w:r>
-        <w:t>Consuming the model registry</w:t>
+        <w:t>Use Audit, Provenance, Manifest, Export, and City Profile Primitives</w:t>
       </w:r>
     </w:p>
     <w:p>
       <w:r>
         <w:rPr>
-          <w:rFonts w:ascii="Courier New" w:hAnsi="Courier New"/>
-          <w:sz w:val="18"/>
+          <w:rFonts w:ascii="Consolas" w:hAnsi="Consolas"/>
         </w:rPr>
-        <w:t>from civiccore.llm import (</w:t>
+        <w:t>from civiccore import (</w:t>
         <w:br/>
-        <w:t xml:space="preserve">    get_active_model,</w:t>
+        <w:t xml:space="preserve">    AuditActor,</w:t>
         <w:br/>
-        <w:t xml:space="preserve">    require_active_model,</w:t>
+        <w:t xml:space="preserve">    AuditHashChain,</w:t>
         <w:br/>
-        <w:t xml:space="preserve">    model_registry_router,</w:t>
+        <w:t xml:space="preserve">    AuditSubject,</w:t>
+        <w:br/>
+        <w:t xml:space="preserve">    CityProfile,</w:t>
+        <w:br/>
+        <w:t xml:space="preserve">    ExportBundle,</w:t>
+        <w:br/>
+        <w:t xml:space="preserve">    ImportManifest,</w:t>
+        <w:br/>
+        <w:t xml:space="preserve">    SourceReference,</w:t>
+        <w:br/>
+        <w:t xml:space="preserve">    validate_bundle,</w:t>
+        <w:br/>
+        <w:t xml:space="preserve">    validate_manifest,</w:t>
         <w:br/>
         <w:t>)</w:t>
         <w:br/>
-        <w:t>from fastapi import FastAPI</w:t>
         <w:br/>
+        <w:t>chain = AuditHashChain()</w:t>
         <w:br/>
-        <w:t>app = FastAPI()</w:t>
+        <w:t>chain.record_event(</w:t>
         <w:br/>
-        <w:t>app.include_router(model_registry_router, prefix="/admin/models")</w:t>
+        <w:t xml:space="preserve">    actor=AuditActor(actor_id="clerk-1", actor_type="staff"),</w:t>
         <w:br/>
+        <w:t xml:space="preserve">    action="packet_exported",</w:t>
         <w:br/>
-        <w:t>active = await require_active_model(session, role="extraction")</w:t>
+        <w:t xml:space="preserve">    subject=AuditSubject(subject_id="meeting-42", subject_type="meeting"),</w:t>
+        <w:br/>
+        <w:t xml:space="preserve">    source_module="civicclerk",</w:t>
+        <w:br/>
+        <w:t>)</w:t>
+        <w:br/>
+        <w:t>assert chain.verify()</w:t>
+      </w:r>
+    </w:p>
+    <w:p>
+      <w:r>
+        <w:t>These primitives are storage-neutral. They give downstream modules a consistent</w:t>
+      </w:r>
+    </w:p>
+    <w:p>
+      <w:r>
+        <w:t>contract without dictating where records are stored.</w:t>
       </w:r>
     </w:p>
     <w:p>
       <w:pPr>
-        <w:pStyle w:val="Heading3"/>
+        <w:pStyle w:val="Heading2"/>
       </w:pPr>
       <w:r>
-        <w:t>Running civiccore migrations from a downstream alembic chain</w:t>
+        <w:t>Run Migrations from a Consumer</w:t>
       </w:r>
     </w:p>
     <w:p>
       <w:r>
-        <w:t>CivicCore ships a baseline migration `civiccore_0001_baseline_v1` that</w:t>
+        <w:t>CivicCore migrations run before a downstream module's migrations. Consumer</w:t>
       </w:r>
     </w:p>
     <w:p>
       <w:r>
-        <w:t>creates the shared schema (prompt_templates, model_registry, llm_audit</w:t>
+        <w:t>modules use CivicCore's migration runner and keep their own version table so</w:t>
       </w:r>
     </w:p>
     <w:p>
       <w:r>
-        <w:t>tables, etc.). Downstream consumers run civiccore's migrations as part of</w:t>
+        <w:t>revision names do not collide.</w:t>
       </w:r>
     </w:p>
     <w:p>
       <w:r>
-        <w:t>their own alembic chain by depending on civiccore's version table.</w:t>
+        <w:t>The release gate verifies the CivicCore migration chain, including</w:t>
       </w:r>
     </w:p>
     <w:p>
       <w:r>
-        <w:t>Pattern:</w:t>
+        <w:t>civiccore0001baselinev1 and civiccore0002llm.</w:t>
+      </w:r>
+    </w:p>
+    <w:p/>
+    <w:p>
+      <w:pPr>
+        <w:pStyle w:val="Heading1"/>
+      </w:pPr>
+      <w:r>
+        <w:t>3. Architecture Reference</w:t>
+      </w:r>
+    </w:p>
+    <w:p>
+      <w:pPr>
+        <w:pStyle w:val="Heading2"/>
+      </w:pPr>
+      <w:r>
+        <w:t>Shipped vs Planned</w:t>
       </w:r>
     </w:p>
     <w:p>
       <w:r>
-        <w:t># In your downstream module's alembic env.py:</w:t>
+        <w:t>Diagram: CivicCore shipped vs planned namespaces (see docs/diagrams/civiccore-extraction-map.svg).</w:t>
       </w:r>
     </w:p>
     <w:p>
       <w:r>
-        <w:t>from civiccore.migrations import include_civiccore_migrations</w:t>
+        <w:t>Shipped implementation in v0.3.0:</w:t>
       </w:r>
     </w:p>
     <w:p>
       <w:r>
-        <w:t>include_civiccore_migrations(context)</w:t>
+        <w:rPr>
+          <w:rFonts w:ascii="Consolas" w:hAnsi="Consolas"/>
+        </w:rPr>
+        <w:t>civiccore/</w:t>
+        <w:br/>
+        <w:t xml:space="preserve">  audit/        hash-chained audit primitives</w:t>
+        <w:br/>
+        <w:t xml:space="preserve">  city_profile/ local city/deployment configuration models</w:t>
+        <w:br/>
+        <w:t xml:space="preserve">  connectors/   offline import/export manifest schemas</w:t>
+        <w:br/>
+        <w:t xml:space="preserve">  db/           shared SQLAlchemy declarative Base</w:t>
+        <w:br/>
+        <w:t xml:space="preserve">  exports/      static export-bundle helpers</w:t>
+        <w:br/>
+        <w:t xml:space="preserve">  llm/          providers, templates, registry, context, structured output</w:t>
+        <w:br/>
+        <w:t xml:space="preserve">  migrations/   migration runner and shared schema baseline</w:t>
+        <w:br/>
+        <w:t xml:space="preserve">  provenance/   source/citation/provenance metadata contracts</w:t>
       </w:r>
     </w:p>
     <w:p>
       <w:r>
-        <w:t># Then your module's revisions can list civiccore_0001_baseline_v1 as</w:t>
+        <w:t>Planned namespaces in v0.3.0:</w:t>
       </w:r>
     </w:p>
     <w:p>
       <w:r>
-        <w:t># a `down_revision` dependency, ensuring civiccore's tables exist</w:t>
+        <w:rPr>
+          <w:rFonts w:ascii="Consolas" w:hAnsi="Consolas"/>
+        </w:rPr>
+        <w:t>civiccore/</w:t>
+        <w:br/>
+        <w:t xml:space="preserve">  auth/          future auth/RBAC extraction</w:t>
+        <w:br/>
+        <w:t xml:space="preserve">  catalog/       future catalog primitives</w:t>
+        <w:br/>
+        <w:t xml:space="preserve">  exemptions/    future 50-state public-records exemption engine</w:t>
+        <w:br/>
+        <w:t xml:space="preserve">  ingest/        future document ingestion</w:t>
+        <w:br/>
+        <w:t xml:space="preserve">  notifications/ future notification primitives</w:t>
+        <w:br/>
+        <w:t xml:space="preserve">  onboarding/    future web onboarding flows</w:t>
+        <w:br/>
+        <w:t xml:space="preserve">  scaffold/      future scaffolding helpers</w:t>
+        <w:br/>
+        <w:t xml:space="preserve">  search/        future hybrid search</w:t>
+        <w:br/>
+        <w:t xml:space="preserve">  verification/  future sovereignty verification</w:t>
+      </w:r>
+    </w:p>
+    <w:p>
+      <w:pPr>
+        <w:pStyle w:val="Heading2"/>
+      </w:pPr>
+      <w:r>
+        <w:t>Migration Order</w:t>
       </w:r>
     </w:p>
     <w:p>
       <w:r>
-        <w:t># before your module's tables reference them.</w:t>
+        <w:t>Diagram: Migration order (see docs/diagrams/migration-order.svg).</w:t>
       </w:r>
     </w:p>
     <w:p>
       <w:r>
-        <w:t>For the canonical pattern, look at `civicrecords-ai`'s `alembic/env.py` —</w:t>
+        <w:t>Consumer applications run CivicCore migrations first, then their own module</w:t>
       </w:r>
     </w:p>
     <w:p>
       <w:r>
-        <w:t>it is the reference integration.</w:t>
+        <w:t>migrations. Separate Alembic version tables prevent revision-name collisions.</w:t>
       </w:r>
     </w:p>
     <w:p>
       <w:pPr>
-        <w:pStyle w:val="Heading3"/>
+        <w:pStyle w:val="Heading2"/>
       </w:pPr>
       <w:r>
-        <w:t>Operating notes</w:t>
+        <w:t>LLM Provider Abstraction</w:t>
+      </w:r>
+    </w:p>
+    <w:p>
+      <w:r>
+        <w:t>Diagram: Provider abstraction (see docs/diagrams/provider-abstraction.svg).</w:t>
+      </w:r>
+    </w:p>
+    <w:p>
+      <w:r>
+        <w:t>The provider abstraction keeps local Ollama as the sovereignty-first default</w:t>
+      </w:r>
+    </w:p>
+    <w:p>
+      <w:r>
+        <w:t>while allowing explicitly configured cloud providers where a city authorizes</w:t>
+      </w:r>
+    </w:p>
+    <w:p>
+      <w:r>
+        <w:t>them.</w:t>
+      </w:r>
+    </w:p>
+    <w:p>
+      <w:pPr>
+        <w:pStyle w:val="Heading2"/>
+      </w:pPr>
+      <w:r>
+        <w:t>Compatibility</w:t>
+      </w:r>
+    </w:p>
+    <w:p>
+      <w:r>
+        <w:t>Current v0.1.0 module foundations still pin civiccore==0.2.0.</w:t>
+      </w:r>
+    </w:p>
+    <w:p>
+      <w:r>
+        <w:t>Production-depth consumers can move to civiccore==0.3.0 after this release</w:t>
+      </w:r>
+    </w:p>
+    <w:p>
+      <w:r>
+        <w:t>and the suite compatibility matrix are updated.</w:t>
+      </w:r>
+    </w:p>
+    <w:p>
+      <w:r>
+        <w:t>The suite-wide matrix lives at:</w:t>
+      </w:r>
+    </w:p>
+    <w:p>
+      <w:r>
+        <w:t>https://github.com/CivicSuite/civicsuite/tree/main/docs/compatibility</w:t>
+      </w:r>
+    </w:p>
+    <w:p/>
+    <w:p>
+      <w:pPr>
+        <w:pStyle w:val="Heading1"/>
+      </w:pPr>
+      <w:r>
+        <w:t>Appendix: Where to File Issues</w:t>
       </w:r>
     </w:p>
     <w:p>
@@ -767,7 +724,7 @@
         <w:pStyle w:val="ListBullet"/>
       </w:pPr>
       <w:r>
-        <w:t>**Idempotent.** Migration application is idempotent; safe to re-run.</w:t>
+        <w:t>CivicCore bug: https://github.com/CivicSuite/civiccore/issues</w:t>
       </w:r>
     </w:p>
     <w:p>
@@ -775,12 +732,7 @@
         <w:pStyle w:val="ListBullet"/>
       </w:pPr>
       <w:r>
-        <w:t>**No network at import time.** Importing `civiccore.llm` does not make</w:t>
-      </w:r>
-    </w:p>
-    <w:p>
-      <w:r>
-        <w:t>any LLM calls. Provider construction is the first network event.</w:t>
+        <w:t>Suite-wide design issue: https://github.com/CivicSuite/civicsuite/issues</w:t>
       </w:r>
     </w:p>
     <w:p>
@@ -788,599 +740,17 @@
         <w:pStyle w:val="ListBullet"/>
       </w:pPr>
       <w:r>
-        <w:t>**No cost tracking.** Per ADR-0004, civiccore does not track LLM spend.</w:t>
+        <w:t>Security issue: follow SECURITY.md; do not file publicly.</w:t>
       </w:r>
     </w:p>
     <w:p>
       <w:r>
-        <w:t>Token counting in `civiccore.llm` is for context-window math only.</w:t>
-      </w:r>
-    </w:p>
-    <w:p>
-      <w:pPr>
-        <w:pStyle w:val="ListBullet"/>
-      </w:pPr>
-      <w:r>
-        <w:t>**Sovereignty default.** Ollama is the default provider in the registry.</w:t>
-      </w:r>
-    </w:p>
-    <w:p>
-      <w:r>
-        <w:t>OpenAI and Anthropic must be explicitly enabled by the operator.</w:t>
-      </w:r>
-    </w:p>
-    <w:p>
-      <w:r>
-        <w:t>---</w:t>
-      </w:r>
-    </w:p>
-    <w:p>
-      <w:pPr>
-        <w:pStyle w:val="Heading2"/>
-      </w:pPr>
-      <w:r>
-        <w:t>3. Architecture reference</w:t>
-      </w:r>
-    </w:p>
-    <w:p>
-      <w:pPr>
-        <w:pStyle w:val="Heading3"/>
-      </w:pPr>
-      <w:r>
-        <w:t>Submodules</w:t>
-      </w:r>
-    </w:p>
-    <w:p>
-      <w:r>
-        <w:t>Shipped (have implementation in v0.2.0):</w:t>
-      </w:r>
-    </w:p>
-    <w:p>
-      <w:r>
-        <w:rPr>
-          <w:rFonts w:ascii="Courier New" w:hAnsi="Courier New"/>
-          <w:sz w:val="18"/>
-        </w:rPr>
-        <w:t>civiccore/</w:t>
-        <w:br/>
-        <w:t>├── db/                  # Shared SQLAlchemy declarative Base</w:t>
-        <w:br/>
-        <w:t>├── migrations/          # Migration runner + civiccore_0001_baseline_v1</w:t>
-        <w:br/>
-        <w:t>│                        # + civiccore_0002_llm Phase 2 ALTER</w:t>
-        <w:br/>
-        <w:t>└── llm/                 # The civiccore.llm module (Phase 2)</w:t>
-        <w:br/>
-        <w:t xml:space="preserve">    ├── providers/       # LLMProvider ABC + Ollama / OpenAI / Anthropic</w:t>
-        <w:br/>
-        <w:t xml:space="preserve">    ├── factory.py       # build_provider() + CONFIG_SCHEMAS</w:t>
-        <w:br/>
-        <w:t xml:space="preserve">    ├── templates/       # PromptTemplate ORM + render + 3-step resolver</w:t>
-        <w:br/>
-        <w:t xml:space="preserve">    ├── registry/        # ModelRegistry ORM + service + admin router</w:t>
-        <w:br/>
-        <w:t xml:space="preserve">    ├── context.py       # TokenBudget, assemble_context, sanitize_for_llm</w:t>
-        <w:br/>
-        <w:t xml:space="preserve">    └── structured.py    # StructuredOutput (Pydantic-validated retry)</w:t>
-      </w:r>
-    </w:p>
-    <w:p>
-      <w:r>
-        <w:t>Planned (placeholder packages exist; implementation is future Phase work):</w:t>
-      </w:r>
-    </w:p>
-    <w:p>
-      <w:r>
-        <w:rPr>
-          <w:rFonts w:ascii="Courier New" w:hAnsi="Courier New"/>
-          <w:sz w:val="18"/>
-        </w:rPr>
-        <w:t>civiccore/</w:t>
-        <w:br/>
-        <w:t>├── audit/               # placeholder — future audit logging</w:t>
-        <w:br/>
-        <w:t>├── auth/                # placeholder — future authentication</w:t>
-        <w:br/>
-        <w:t>├── catalog/             # placeholder — future catalog primitives</w:t>
-        <w:br/>
-        <w:t>├── connectors/          # placeholder — future external connectors</w:t>
-        <w:br/>
-        <w:t>├── exemptions/          # placeholder — future 50-state exemption engine</w:t>
-        <w:br/>
-        <w:t>├── ingest/              # placeholder — future document ingestion</w:t>
-        <w:br/>
-        <w:t>├── notifications/       # placeholder — future notification primitives</w:t>
-        <w:br/>
-        <w:t>├── onboarding/          # placeholder — future onboarding flows</w:t>
-        <w:br/>
-        <w:t>├── scaffold/            # placeholder — future scaffolding helpers</w:t>
-        <w:br/>
-        <w:t>├── search/              # placeholder — future hybrid search</w:t>
-        <w:br/>
-        <w:t>└── verification/        # placeholder — future sovereignty verification</w:t>
-      </w:r>
-    </w:p>
-    <w:p>
-      <w:r>
-        <w:t>Each placeholder directory contains only an `__init__.py` docstring stub.</w:t>
-      </w:r>
-    </w:p>
-    <w:p>
-      <w:r>
-        <w:t>These namespaces are reserved import paths, not capability — do not</w:t>
-      </w:r>
-    </w:p>
-    <w:p>
-      <w:r>
-        <w:t>import from them in downstream code until they ship.</w:t>
-      </w:r>
-    </w:p>
-    <w:p>
-      <w:r>
-        <w:drawing>
-          <wp:inline xmlns:a="http://schemas.openxmlformats.org/drawingml/2006/main" xmlns:pic="http://schemas.openxmlformats.org/drawingml/2006/picture">
-            <wp:extent cx="5486400" cy="6660444"/>
-            <wp:docPr id="1" name="Picture 1"/>
-            <wp:cNvGraphicFramePr>
-              <a:graphicFrameLocks noChangeAspect="1"/>
-            </wp:cNvGraphicFramePr>
-            <a:graphic>
-              <a:graphicData uri="http://schemas.openxmlformats.org/drawingml/2006/picture">
-                <pic:pic>
-                  <pic:nvPicPr>
-                    <pic:cNvPr id="0" name="civiccore-extraction-map.png"/>
-                    <pic:cNvPicPr/>
-                  </pic:nvPicPr>
-                  <pic:blipFill>
-                    <a:blip r:embed="rId9"/>
-                    <a:stretch>
-                      <a:fillRect/>
-                    </a:stretch>
-                  </pic:blipFill>
-                  <pic:spPr>
-                    <a:xfrm>
-                      <a:off x="0" y="0"/>
-                      <a:ext cx="5486400" cy="6660444"/>
-                    </a:xfrm>
-                    <a:prstGeom prst="rect"/>
-                  </pic:spPr>
-                </pic:pic>
-              </a:graphicData>
-            </a:graphic>
-          </wp:inline>
-        </w:drawing>
-      </w:r>
-    </w:p>
-    <w:p>
-      <w:pPr>
-        <w:pStyle w:val="Heading3"/>
-      </w:pPr>
-      <w:r>
-        <w:t>How CivicCore fits with downstream consumers</w:t>
-      </w:r>
-    </w:p>
-    <w:p>
-      <w:r>
-        <w:rPr>
-          <w:rFonts w:ascii="Courier New" w:hAnsi="Courier New"/>
-          <w:sz w:val="18"/>
-        </w:rPr>
-        <w:t>+---------------------------------------------------------------+</w:t>
-        <w:br/>
-        <w:t>|                  Downstream consumer (e.g. records-ai)        |</w:t>
-        <w:br/>
-        <w:t>|                                                               |</w:t>
-        <w:br/>
-        <w:t>|   FastAPI app   alembic chain   business logic   UI           |</w:t>
-        <w:br/>
-        <w:t>|        |              |               |                       |</w:t>
-        <w:br/>
-        <w:t>+--------|--------------|---------------|-----------------------+</w:t>
-        <w:br/>
-        <w:t xml:space="preserve">         |              |               |</w:t>
-        <w:br/>
-        <w:t xml:space="preserve">         |              |               |  imports</w:t>
-        <w:br/>
-        <w:t xml:space="preserve">         v              v               v</w:t>
-        <w:br/>
-        <w:t>+---------------------------------------------------------------+</w:t>
-        <w:br/>
-        <w:t>|                       civiccore (library)                     |</w:t>
-        <w:br/>
-        <w:t>|                                                               |</w:t>
-        <w:br/>
-        <w:t>|   civiccore.llm                  civiccore.migrations         |</w:t>
-        <w:br/>
-        <w:t>|     - provider registry           - runner                    |</w:t>
-        <w:br/>
-        <w:t>|     - prompt templates            - civiccore_0001_baseline   |</w:t>
-        <w:br/>
-        <w:t>|     - model registry             civiccore.db                 |</w:t>
-        <w:br/>
-        <w:t>|     - context utils               - shared declarative Base   |</w:t>
-        <w:br/>
-        <w:t>|     - structured output                                       |</w:t>
-        <w:br/>
-        <w:t>|                                                               |</w:t>
-        <w:br/>
-        <w:t>+---------------------------------------------------------------+</w:t>
-        <w:br/>
-        <w:t xml:space="preserve">         |              |               |</w:t>
-        <w:br/>
-        <w:t xml:space="preserve">         v              v               v</w:t>
-        <w:br/>
-        <w:t>+---------------------------------------------------------------+</w:t>
-        <w:br/>
-        <w:t>|              External services (operator-controlled)          |</w:t>
-        <w:br/>
-        <w:t>|                                                               |</w:t>
-        <w:br/>
-        <w:t>|   Ollama (default)   PostgreSQL    OpenAI*    Anthropic*      |</w:t>
-        <w:br/>
-        <w:t>|                                                               |</w:t>
-        <w:br/>
-        <w:t>|   * opt-in; require explicit registry entry + SDK install     |</w:t>
-        <w:br/>
-        <w:t>+---------------------------------------------------------------+</w:t>
-      </w:r>
-    </w:p>
-    <w:p>
-      <w:pPr>
-        <w:pStyle w:val="Heading3"/>
-      </w:pPr>
-      <w:r>
-        <w:t>Migration ordering contract</w:t>
-      </w:r>
-    </w:p>
-    <w:p>
-      <w:r>
-        <w:t>CivicCore migrations are designed to run **before** any downstream</w:t>
-      </w:r>
-    </w:p>
-    <w:p>
-      <w:r>
-        <w:t>consumer's migrations. Downstream consumers reference civiccore's tables</w:t>
-      </w:r>
-    </w:p>
-    <w:p>
-      <w:r>
-        <w:t>in foreign keys and must list `civiccore_0001_baseline_v1` (or a later</w:t>
-      </w:r>
-    </w:p>
-    <w:p>
-      <w:r>
-        <w:t>civiccore revision) as a `down_revision`.</w:t>
-      </w:r>
-    </w:p>
-    <w:p>
-      <w:r>
-        <w:t>The migration runner uses idempotent guards — re-running a migration that</w:t>
-      </w:r>
-    </w:p>
-    <w:p>
-      <w:r>
-        <w:t>has already been applied is a no-op, not a failure.</w:t>
-      </w:r>
-    </w:p>
-    <w:p>
-      <w:r>
-        <w:drawing>
-          <wp:inline xmlns:a="http://schemas.openxmlformats.org/drawingml/2006/main" xmlns:pic="http://schemas.openxmlformats.org/drawingml/2006/picture">
-            <wp:extent cx="5486400" cy="3511296"/>
-            <wp:docPr id="2" name="Picture 2"/>
-            <wp:cNvGraphicFramePr>
-              <a:graphicFrameLocks noChangeAspect="1"/>
-            </wp:cNvGraphicFramePr>
-            <a:graphic>
-              <a:graphicData uri="http://schemas.openxmlformats.org/drawingml/2006/picture">
-                <pic:pic>
-                  <pic:nvPicPr>
-                    <pic:cNvPr id="0" name="migration-order.png"/>
-                    <pic:cNvPicPr/>
-                  </pic:nvPicPr>
-                  <pic:blipFill>
-                    <a:blip r:embed="rId10"/>
-                    <a:stretch>
-                      <a:fillRect/>
-                    </a:stretch>
-                  </pic:blipFill>
-                  <pic:spPr>
-                    <a:xfrm>
-                      <a:off x="0" y="0"/>
-                      <a:ext cx="5486400" cy="3511296"/>
-                    </a:xfrm>
-                    <a:prstGeom prst="rect"/>
-                  </pic:spPr>
-                </pic:pic>
-              </a:graphicData>
-            </a:graphic>
-          </wp:inline>
-        </w:drawing>
-      </w:r>
-    </w:p>
-    <w:p>
-      <w:pPr>
-        <w:pStyle w:val="Heading3"/>
-      </w:pPr>
-      <w:r>
-        <w:t>Provider abstraction</w:t>
-      </w:r>
-    </w:p>
-    <w:p>
-      <w:r>
-        <w:rPr>
-          <w:rFonts w:ascii="Courier New" w:hAnsi="Courier New"/>
-          <w:sz w:val="18"/>
-        </w:rPr>
-        <w:t>LLMProvider (ABC)</w:t>
-        <w:br/>
-        <w:t xml:space="preserve">   |</w:t>
-        <w:br/>
-        <w:t xml:space="preserve">   +-- OllamaProvider          (built-in, default; uses httpx)</w:t>
-        <w:br/>
-        <w:t xml:space="preserve">   +-- OpenAIProvider          (built-in; opt-in; pip install openai)</w:t>
-        <w:br/>
-        <w:t xml:space="preserve">   +-- AnthropicProvider       (built-in; opt-in; pip install anthropic)</w:t>
-        <w:br/>
-        <w:t xml:space="preserve">   +-- (third-party providers via @register_provider)</w:t>
-      </w:r>
-    </w:p>
-    <w:p>
-      <w:r>
-        <w:t>Construction goes through `build_provider(config)` (the factory) or</w:t>
-      </w:r>
-    </w:p>
-    <w:p>
-      <w:r>
-        <w:t>`get_provider(name, **kwargs)` (the registry shortcut). The ABC defines an</w:t>
-      </w:r>
-    </w:p>
-    <w:p>
-      <w:r>
-        <w:t>async `generate(system_prompt, user_content, **kwargs)` contract; concrete</w:t>
-      </w:r>
-    </w:p>
-    <w:p>
-      <w:r>
-        <w:t>providers implement transport, auth, and serialization details.</w:t>
-      </w:r>
-    </w:p>
-    <w:p>
-      <w:r>
-        <w:drawing>
-          <wp:inline xmlns:a="http://schemas.openxmlformats.org/drawingml/2006/main" xmlns:pic="http://schemas.openxmlformats.org/drawingml/2006/picture">
-            <wp:extent cx="5486400" cy="1717964"/>
-            <wp:docPr id="3" name="Picture 3"/>
-            <wp:cNvGraphicFramePr>
-              <a:graphicFrameLocks noChangeAspect="1"/>
-            </wp:cNvGraphicFramePr>
-            <a:graphic>
-              <a:graphicData uri="http://schemas.openxmlformats.org/drawingml/2006/picture">
-                <pic:pic>
-                  <pic:nvPicPr>
-                    <pic:cNvPr id="0" name="provider-abstraction.png"/>
-                    <pic:cNvPicPr/>
-                  </pic:nvPicPr>
-                  <pic:blipFill>
-                    <a:blip r:embed="rId11"/>
-                    <a:stretch>
-                      <a:fillRect/>
-                    </a:stretch>
-                  </pic:blipFill>
-                  <pic:spPr>
-                    <a:xfrm>
-                      <a:off x="0" y="0"/>
-                      <a:ext cx="5486400" cy="1717964"/>
-                    </a:xfrm>
-                    <a:prstGeom prst="rect"/>
-                  </pic:spPr>
-                </pic:pic>
-              </a:graphicData>
-            </a:graphic>
-          </wp:inline>
-        </w:drawing>
-      </w:r>
-    </w:p>
-    <w:p>
-      <w:pPr>
-        <w:pStyle w:val="Heading3"/>
-      </w:pPr>
-      <w:r>
-        <w:t>Prompt template 3-step resolver</w:t>
-      </w:r>
-    </w:p>
-    <w:p>
-      <w:r>
-        <w:rPr>
-          <w:rFonts w:ascii="Courier New" w:hAnsi="Courier New"/>
-          <w:sz w:val="18"/>
-        </w:rPr>
-        <w:t>resolve_template(session, name, consumer_app)</w:t>
-        <w:br/>
-        <w:br/>
-        <w:t xml:space="preserve">   1. App DB override</w:t>
-        <w:br/>
-        <w:t xml:space="preserve">        consumer_app=&lt;requesting app&gt;</w:t>
-        <w:br/>
-        <w:t xml:space="preserve">        is_override=True, is_active=True, highest version</w:t>
-        <w:br/>
-        <w:br/>
-        <w:t xml:space="preserve">   2. App code-level override</w:t>
-        <w:br/>
-        <w:t xml:space="preserve">        OVERRIDE_REGISTRY[(consumer_app, name)]</w:t>
-        <w:br/>
-        <w:t xml:space="preserve">        registered via register_template_override()</w:t>
-        <w:br/>
-        <w:br/>
-        <w:t xml:space="preserve">   3. CivicCore default</w:t>
-        <w:br/>
-        <w:t xml:space="preserve">        consumer_app="civiccore"</w:t>
-        <w:br/>
-        <w:t xml:space="preserve">        is_override=False, is_active=True, highest version</w:t>
-        <w:br/>
-        <w:br/>
-        <w:t xml:space="preserve">   else: PromptTemplateNotFoundError</w:t>
-      </w:r>
-    </w:p>
-    <w:p>
-      <w:r>
-        <w:t>DB overrides win over code overrides so operators retain production</w:t>
-      </w:r>
-    </w:p>
-    <w:p>
-      <w:r>
-        <w:t>hot-fix capability without a code deploy.</w:t>
-      </w:r>
-    </w:p>
-    <w:p>
-      <w:pPr>
-        <w:pStyle w:val="Heading3"/>
-      </w:pPr>
-      <w:r>
-        <w:t>Context utilities and structured output</w:t>
-      </w:r>
-    </w:p>
-    <w:p>
-      <w:r>
-        <w:t>`assemble_context()` packs system prompt + retrieved chunks into a</w:t>
-      </w:r>
-    </w:p>
-    <w:p>
-      <w:r>
-        <w:t>token-budgeted prompt, applying `sanitize_for_llm()` at chunk boundaries</w:t>
-      </w:r>
-    </w:p>
-    <w:p>
-      <w:r>
-        <w:t>to defuse prompt-injection attempts in retrieved content. `StructuredOutput`</w:t>
-      </w:r>
-    </w:p>
-    <w:p>
-      <w:r>
-        <w:t>wraps a provider call with a Pydantic schema; if the model returns</w:t>
-      </w:r>
-    </w:p>
-    <w:p>
-      <w:r>
-        <w:t>malformed JSON, it retries up to `max_attempts` times before raising</w:t>
-      </w:r>
-    </w:p>
-    <w:p>
-      <w:r>
-        <w:t>`StructuredOutputFailure`.</w:t>
-      </w:r>
-    </w:p>
-    <w:p>
-      <w:pPr>
-        <w:pStyle w:val="Heading3"/>
-      </w:pPr>
-      <w:r>
-        <w:t>Sovereignty and ADR-0004</w:t>
-      </w:r>
-    </w:p>
-    <w:p>
-      <w:pPr>
-        <w:pStyle w:val="ListBullet"/>
-      </w:pPr>
-      <w:r>
-        <w:t>No cost tracking, no spend limits in civiccore.</w:t>
-      </w:r>
-    </w:p>
-    <w:p>
-      <w:pPr>
-        <w:pStyle w:val="ListBullet"/>
-      </w:pPr>
-      <w:r>
-        <w:t>No telemetry; no phone-home.</w:t>
-      </w:r>
-    </w:p>
-    <w:p>
-      <w:pPr>
-        <w:pStyle w:val="ListBullet"/>
-      </w:pPr>
-      <w:r>
-        <w:t>Local-first default (Ollama).</w:t>
-      </w:r>
-    </w:p>
-    <w:p>
-      <w:pPr>
-        <w:pStyle w:val="ListBullet"/>
-      </w:pPr>
-      <w:r>
-        <w:t>Cloud providers are opt-in and require an explicit registry entry.</w:t>
-      </w:r>
-    </w:p>
-    <w:p>
-      <w:r>
-        <w:t>For the full design rationale see CivicCore Extraction Spec section 12 and</w:t>
-      </w:r>
-    </w:p>
-    <w:p>
-      <w:r>
-        <w:t>ADR-0004 in the civicsuite umbrella repo.</w:t>
-      </w:r>
-    </w:p>
-    <w:p>
-      <w:r>
-        <w:t>---</w:t>
-      </w:r>
-    </w:p>
-    <w:p>
-      <w:pPr>
-        <w:pStyle w:val="Heading2"/>
-      </w:pPr>
-      <w:r>
-        <w:t>Appendix: Where to file issues</w:t>
-      </w:r>
-    </w:p>
-    <w:p>
-      <w:pPr>
-        <w:pStyle w:val="ListBullet"/>
-      </w:pPr>
-      <w:r>
-        <w:t>**Bug in civiccore itself** — file at https://github.com/CivicSuite/civiccore/issues</w:t>
-      </w:r>
-    </w:p>
-    <w:p>
-      <w:pPr>
-        <w:pStyle w:val="ListBullet"/>
-      </w:pPr>
-      <w:r>
-        <w:t>**Bug that surfaces in records-ai but is caused by civiccore** — file at civiccore.</w:t>
-      </w:r>
-    </w:p>
-    <w:p>
-      <w:pPr>
-        <w:pStyle w:val="ListBullet"/>
-      </w:pPr>
-      <w:r>
-        <w:t>**Bug in records-ai** — file at https://github.com/CivicSuite/civicrecords-ai/issues</w:t>
-      </w:r>
-    </w:p>
-    <w:p>
-      <w:pPr>
-        <w:pStyle w:val="ListBullet"/>
-      </w:pPr>
-      <w:r>
-        <w:t>**Suite-wide design / cross-module question** — file at https://github.com/CivicSuite/civicsuite/issues</w:t>
-      </w:r>
-    </w:p>
-    <w:p>
-      <w:pPr>
-        <w:pStyle w:val="ListBullet"/>
-      </w:pPr>
-      <w:r>
-        <w:t>**Security vulnerability** — see SECURITY.md (do not file publicly).</w:t>
-      </w:r>
-    </w:p>
-    <w:p>
-      <w:r>
-        <w:t>The decision tree in CONTRIBUTING.md has the full rules.</w:t>
+        <w:t>The decision tree in CONTRIBUTING.md has the full routing rules.</w:t>
       </w:r>
     </w:p>
     <w:sectPr>
       <w:pgSz w:w="12240" w:h="15840"/>
-      <w:pgMar w:top="1440" w:right="1800" w:bottom="1440" w:left="1800" w:header="720" w:footer="720" w:gutter="0"/>
+      <w:pgMar w:top="1008" w:right="1080" w:bottom="1008" w:left="1080" w:header="720" w:footer="720" w:gutter="0"/>
       <w:cols w:space="720"/>
       <w:docGrid w:linePitch="360"/>
     </w:sectPr>

</xml_diff>

<commit_message>
docs: add CivicCore Tier 1 retrofit ledger
</commit_message>
<xml_diff>
--- a/USER-MANUAL.docx
+++ b/USER-MANUAL.docx
@@ -4,7 +4,7 @@
   <w:body>
     <w:p>
       <w:pPr>
-        <w:pStyle w:val="Title"/>
+        <w:pStyle w:val="Heading1"/>
       </w:pPr>
       <w:r>
         <w:t>CivicCore User Manual</w:t>
@@ -12,7 +12,7 @@
     </w:p>
     <w:p>
       <w:r>
-        <w:t>Version: v0.3.0</w:t>
+        <w:t>Version: v0.22.1 (first attested baseline release)</w:t>
       </w:r>
     </w:p>
     <w:p>
@@ -31,33 +31,28 @@
       </w:r>
     </w:p>
     <w:p>
-      <w:pPr>
-        <w:pStyle w:val="ListNumber"/>
-      </w:pPr>
       <w:r>
-        <w:t>Non-technical evaluators - what CivicCore is and why it matters.</w:t>
+        <w:t>1. Non-technical evaluators - what CivicCore is and why it matters.</w:t>
+      </w:r>
+    </w:p>
+    <w:p>
+      <w:r>
+        <w:t>2. IT and module developers - how to install it and consume the public API.</w:t>
+      </w:r>
+    </w:p>
+    <w:p>
+      <w:r>
+        <w:t>3. Architecture reviewers - what ships today, what is planned, and how the library fits into the CivicSuite stack.</w:t>
+      </w:r>
+    </w:p>
+    <w:p>
+      <w:r>
+        <w:t>---</w:t>
       </w:r>
     </w:p>
     <w:p>
       <w:pPr>
-        <w:pStyle w:val="ListNumber"/>
-      </w:pPr>
-      <w:r>
-        <w:t>IT and module developers - how to install it and consume the public API.</w:t>
-      </w:r>
-    </w:p>
-    <w:p>
-      <w:pPr>
-        <w:pStyle w:val="ListNumber"/>
-      </w:pPr>
-      <w:r>
-        <w:t>Architecture reviewers - what ships today, what is planned, and how the library fits into the CivicSuite stack.</w:t>
-      </w:r>
-    </w:p>
-    <w:p/>
-    <w:p>
-      <w:pPr>
-        <w:pStyle w:val="Heading1"/>
+        <w:pStyle w:val="Heading2"/>
       </w:pPr>
       <w:r>
         <w:t>1. Non-Technical Overview</w:t>
@@ -65,7 +60,7 @@
     </w:p>
     <w:p>
       <w:pPr>
-        <w:pStyle w:val="Heading2"/>
+        <w:pStyle w:val="Heading3"/>
       </w:pPr>
       <w:r>
         <w:t>What CivicCore Is</w:t>
@@ -108,10 +103,10 @@
     </w:p>
     <w:p>
       <w:pPr>
-        <w:pStyle w:val="Heading2"/>
+        <w:pStyle w:val="Heading3"/>
       </w:pPr>
       <w:r>
-        <w:t>What v0.3.0 Ships</w:t>
+        <w:t>What the current development line ships</w:t>
       </w:r>
     </w:p>
     <w:p>
@@ -124,7 +119,7 @@
     </w:p>
     <w:p>
       <w:r>
-        <w:t xml:space="preserve">  schema baseline.</w:t>
+        <w:t>schema baseline.</w:t>
       </w:r>
     </w:p>
     <w:p>
@@ -145,7 +140,7 @@
     </w:p>
     <w:p>
       <w:r>
-        <w:t xml:space="preserve">  context utilities, and structured-output helpers.</w:t>
+        <w:t>context utilities, and structured-output helpers.</w:t>
       </w:r>
     </w:p>
     <w:p>
@@ -158,7 +153,12 @@
     </w:p>
     <w:p>
       <w:r>
-        <w:t xml:space="preserve">  event streams.</w:t>
+        <w:t>event streams plus legacy-compatible persisted audit-log verification</w:t>
+      </w:r>
+    </w:p>
+    <w:p>
+      <w:r>
+        <w:t>helpers.</w:t>
       </w:r>
     </w:p>
     <w:p>
@@ -171,7 +171,7 @@
     </w:p>
     <w:p>
       <w:r>
-        <w:t xml:space="preserve">  contracts.</w:t>
+        <w:t>contracts.</w:t>
       </w:r>
     </w:p>
     <w:p>
@@ -179,7 +179,35 @@
         <w:pStyle w:val="ListBullet"/>
       </w:pPr>
       <w:r>
-        <w:t>civiccore.connectors - offline import/export manifest schemas.</w:t>
+        <w:t>civiccore.connectors - offline import/export manifest schemas,</w:t>
+      </w:r>
+    </w:p>
+    <w:p>
+      <w:r>
+        <w:t>local-first import helpers for supported agenda-platform payloads, and</w:t>
+      </w:r>
+    </w:p>
+    <w:p>
+      <w:r>
+        <w:t>storage-neutral live-sync retry/circuit-breaker primitives plus vendor</w:t>
+      </w:r>
+    </w:p>
+    <w:p>
+      <w:r>
+        <w:t>delta request planning and source-list status projection.</w:t>
+      </w:r>
+    </w:p>
+    <w:p>
+      <w:pPr>
+        <w:pStyle w:val="ListBullet"/>
+      </w:pPr>
+      <w:r>
+        <w:t>civiccore.testing - no-network mock-city proof contracts for supported</w:t>
+      </w:r>
+    </w:p>
+    <w:p>
+      <w:r>
+        <w:t>agenda vendors, municipal OIDC, and backup-retention/off-host readiness.</w:t>
       </w:r>
     </w:p>
     <w:p>
@@ -195,20 +223,93 @@
         <w:pStyle w:val="ListBullet"/>
       </w:pPr>
       <w:r>
-        <w:t>civiccore.cityprofile - local city/deployment configuration models.</w:t>
+        <w:t>civiccore.city_profile - local city/deployment configuration models.</w:t>
       </w:r>
     </w:p>
     <w:p>
       <w:pPr>
-        <w:pStyle w:val="Heading2"/>
+        <w:pStyle w:val="ListBullet"/>
       </w:pPr>
       <w:r>
-        <w:t>What v0.3.0 Does Not Ship Yet</w:t>
+        <w:t>civiccore.auth - bearer-token role helpers plus trusted-header config and</w:t>
       </w:r>
     </w:p>
     <w:p>
       <w:r>
-        <w:t>The following namespaces remain planned extraction targets: civiccore.auth,</w:t>
+        <w:t>source-boundary helpers for protected or mixed public/staff FastAPI routes.</w:t>
+      </w:r>
+    </w:p>
+    <w:p>
+      <w:pPr>
+        <w:pStyle w:val="ListBullet"/>
+      </w:pPr>
+      <w:r>
+        <w:t>civiccore.verification - content-bound browser release-evidence helpers.</w:t>
+      </w:r>
+    </w:p>
+    <w:p>
+      <w:pPr>
+        <w:pStyle w:val="ListBullet"/>
+      </w:pPr>
+      <w:r>
+        <w:t>civiccore.search - deterministic text normalization, matching, and</w:t>
+      </w:r>
+    </w:p>
+    <w:p>
+      <w:r>
+        <w:t>reciprocal-rank-fusion helpers.</w:t>
+      </w:r>
+    </w:p>
+    <w:p>
+      <w:pPr>
+        <w:pStyle w:val="ListBullet"/>
+      </w:pPr>
+      <w:r>
+        <w:t>civiccore.notifications - notice deadline planning and publication</w:t>
+      </w:r>
+    </w:p>
+    <w:p>
+      <w:r>
+        <w:t>compliance helpers with actionable warning codes.</w:t>
+      </w:r>
+    </w:p>
+    <w:p>
+      <w:pPr>
+        <w:pStyle w:val="ListBullet"/>
+      </w:pPr>
+      <w:r>
+        <w:t>civiccore.onboarding - storage-neutral onboarding profile field order,</w:t>
+      </w:r>
+    </w:p>
+    <w:p>
+      <w:r>
+        <w:t>answer parsing, completion-state, and next-question helpers.</w:t>
+      </w:r>
+    </w:p>
+    <w:p>
+      <w:pPr>
+        <w:pStyle w:val="ListBullet"/>
+      </w:pPr>
+      <w:r>
+        <w:t>civiccore.scheduling - storage-neutral cron validation and next-run</w:t>
+      </w:r>
+    </w:p>
+    <w:p>
+      <w:r>
+        <w:t>helpers for module background jobs.</w:t>
+      </w:r>
+    </w:p>
+    <w:p>
+      <w:pPr>
+        <w:pStyle w:val="Heading3"/>
+      </w:pPr>
+      <w:r>
+        <w:t>What the current development line does not ship yet</w:t>
+      </w:r>
+    </w:p>
+    <w:p>
+      <w:r>
+        <w:t>The following namespaces remain planned extraction targets:</w:t>
       </w:r>
     </w:p>
     <w:p>
@@ -218,37 +319,47 @@
     </w:p>
     <w:p>
       <w:r>
-        <w:t>civiccore.notifications, civiccore.onboarding, civiccore.scaffold,</w:t>
+        <w:t>and civiccore.scaffold.</w:t>
       </w:r>
     </w:p>
     <w:p>
       <w:r>
-        <w:t>civiccore.search, and civiccore.verification.</w:t>
+        <w:t>civiccore.onboarding now ships shared profile interview helpers, but</w:t>
       </w:r>
     </w:p>
     <w:p>
       <w:r>
-        <w:t>Live connector sync, credential storage, vendor write-back, document ingestion,</w:t>
+        <w:t>full web onboarding flows and persistence orchestration are still not</w:t>
       </w:r>
     </w:p>
     <w:p>
       <w:r>
-        <w:t>search indexing, notification delivery, auth/RBAC, and legal determinations are</w:t>
+        <w:t>shipped platform behavior.</w:t>
       </w:r>
     </w:p>
     <w:p>
       <w:r>
-        <w:t>also not shipped in v0.3.0. Downstream modules must not promote those behaviors</w:t>
+        <w:t>Credential storage, vendor-specific network adapters, vendor write-back,</w:t>
       </w:r>
     </w:p>
     <w:p>
       <w:r>
-        <w:t>as shipped CivicCore capability.</w:t>
+        <w:t>document ingestion, search indexing, notification delivery queues, and legal</w:t>
+      </w:r>
+    </w:p>
+    <w:p>
+      <w:r>
+        <w:t>determinations are also not shipped platform behaviors. Downstream modules must</w:t>
+      </w:r>
+    </w:p>
+    <w:p>
+      <w:r>
+        <w:t>not promote those behaviors as shipped CivicCore capability.</w:t>
       </w:r>
     </w:p>
     <w:p>
       <w:pPr>
-        <w:pStyle w:val="Heading2"/>
+        <w:pStyle w:val="Heading3"/>
       </w:pPr>
       <w:r>
         <w:t>Why Municipal Teams Should Care</w:t>
@@ -264,7 +375,7 @@
     </w:p>
     <w:p>
       <w:r>
-        <w:t xml:space="preserve">  infrastructure.</w:t>
+        <w:t>infrastructure.</w:t>
       </w:r>
     </w:p>
     <w:p>
@@ -277,7 +388,7 @@
     </w:p>
     <w:p>
       <w:r>
-        <w:t xml:space="preserve">  versioned primitives rather than copying logic.</w:t>
+        <w:t>versioned primitives rather than copying logic.</w:t>
       </w:r>
     </w:p>
     <w:p>
@@ -290,13 +401,17 @@
     </w:p>
     <w:p>
       <w:r>
-        <w:t xml:space="preserve">  chains make compliance evidence more consistent across modules.</w:t>
+        <w:t>chains make compliance evidence more consistent across modules.</w:t>
       </w:r>
     </w:p>
-    <w:p/>
+    <w:p>
+      <w:r>
+        <w:t>---</w:t>
+      </w:r>
+    </w:p>
     <w:p>
       <w:pPr>
-        <w:pStyle w:val="Heading1"/>
+        <w:pStyle w:val="Heading2"/>
       </w:pPr>
       <w:r>
         <w:t>2. Technical Guide for IT and Module Developers</w:t>
@@ -304,7 +419,7 @@
     </w:p>
     <w:p>
       <w:pPr>
-        <w:pStyle w:val="Heading2"/>
+        <w:pStyle w:val="Heading3"/>
       </w:pPr>
       <w:r>
         <w:t>Install from a Release Wheel</w:t>
@@ -318,9 +433,10 @@
     <w:p>
       <w:r>
         <w:rPr>
-          <w:rFonts w:ascii="Consolas" w:hAnsi="Consolas"/>
+          <w:rFonts w:ascii="Courier New" w:hAnsi="Courier New"/>
+          <w:sz w:val="18"/>
         </w:rPr>
-        <w:t>pip install https://github.com/CivicSuite/civiccore/releases/download/v0.3.0/civiccore-0.3.0-py3-none-any.whl</w:t>
+        <w:t>pip install https://github.com/CivicSuite/civiccore/releases/download/v0.22.1/civiccore-0.22.1-py3-none-any.whl</w:t>
       </w:r>
     </w:p>
     <w:p>
@@ -336,13 +452,39 @@
     <w:p>
       <w:r>
         <w:rPr>
-          <w:rFonts w:ascii="Consolas" w:hAnsi="Consolas"/>
+          <w:rFonts w:ascii="Courier New" w:hAnsi="Courier New"/>
+          <w:sz w:val="18"/>
         </w:rPr>
         <w:t>curl -L -o SHA256SUMS.txt \</w:t>
         <w:br/>
-        <w:t xml:space="preserve">  https://github.com/CivicSuite/civiccore/releases/download/v0.3.0/SHA256SUMS.txt</w:t>
+        <w:t xml:space="preserve">  https://github.com/CivicSuite/civiccore/releases/download/v0.22.1/SHA256SUMS.txt</w:t>
         <w:br/>
         <w:t>sha256sum -c SHA256SUMS.txt</w:t>
+      </w:r>
+    </w:p>
+    <w:p>
+      <w:r>
+        <w:t>v0.22.1 is the first CivicCore release with a Sigstore-signed</w:t>
+      </w:r>
+    </w:p>
+    <w:p>
+      <w:r>
+        <w:t>release-attestation.json and bundle. Earlier CivicCore releases are retained</w:t>
+      </w:r>
+    </w:p>
+    <w:p>
+      <w:r>
+        <w:t>for historical installs only and must not be treated as provenance baselines</w:t>
+      </w:r>
+    </w:p>
+    <w:p>
+      <w:r>
+        <w:t>unless a future additive attestation is explicitly authorized, published, and</w:t>
+      </w:r>
+    </w:p>
+    <w:p>
+      <w:r>
+        <w:t>recorded in docs/ops/civiccore-tier1-retrofit-ledger.md.</w:t>
       </w:r>
     </w:p>
     <w:p>
@@ -353,7 +495,8 @@
     <w:p>
       <w:r>
         <w:rPr>
-          <w:rFonts w:ascii="Consolas" w:hAnsi="Consolas"/>
+          <w:rFonts w:ascii="Courier New" w:hAnsi="Courier New"/>
+          <w:sz w:val="18"/>
         </w:rPr>
         <w:t>git clone https://github.com/CivicSuite/civiccore.git</w:t>
         <w:br/>
@@ -364,7 +507,7 @@
     </w:p>
     <w:p>
       <w:pPr>
-        <w:pStyle w:val="Heading2"/>
+        <w:pStyle w:val="Heading3"/>
       </w:pPr>
       <w:r>
         <w:t>Use LLM Providers</w:t>
@@ -373,7 +516,8 @@
     <w:p>
       <w:r>
         <w:rPr>
-          <w:rFonts w:ascii="Consolas" w:hAnsi="Consolas"/>
+          <w:rFonts w:ascii="Courier New" w:hAnsi="Courier New"/>
+          <w:sz w:val="18"/>
         </w:rPr>
         <w:t>from civiccore.llm import get_provider</w:t>
         <w:br/>
@@ -402,7 +546,8 @@
     <w:p>
       <w:r>
         <w:rPr>
-          <w:rFonts w:ascii="Consolas" w:hAnsi="Consolas"/>
+          <w:rFonts w:ascii="Courier New" w:hAnsi="Courier New"/>
+          <w:sz w:val="18"/>
         </w:rPr>
         <w:t>pip install openai</w:t>
         <w:br/>
@@ -411,7 +556,7 @@
     </w:p>
     <w:p>
       <w:pPr>
-        <w:pStyle w:val="Heading2"/>
+        <w:pStyle w:val="Heading3"/>
       </w:pPr>
       <w:r>
         <w:t>Use Prompt Templates</w:t>
@@ -420,7 +565,8 @@
     <w:p>
       <w:r>
         <w:rPr>
-          <w:rFonts w:ascii="Consolas" w:hAnsi="Consolas"/>
+          <w:rFonts w:ascii="Courier New" w:hAnsi="Courier New"/>
+          <w:sz w:val="18"/>
         </w:rPr>
         <w:t>from civiccore.llm import render_template, resolve_template</w:t>
         <w:br/>
@@ -450,7 +596,7 @@
     </w:p>
     <w:p>
       <w:pPr>
-        <w:pStyle w:val="Heading2"/>
+        <w:pStyle w:val="Heading3"/>
       </w:pPr>
       <w:r>
         <w:t>Use Audit, Provenance, Manifest, Export, and City Profile Primitives</w:t>
@@ -459,7 +605,8 @@
     <w:p>
       <w:r>
         <w:rPr>
-          <w:rFonts w:ascii="Consolas" w:hAnsi="Consolas"/>
+          <w:rFonts w:ascii="Courier New" w:hAnsi="Courier New"/>
+          <w:sz w:val="18"/>
         </w:rPr>
         <w:t>from civiccore import (</w:t>
         <w:br/>
@@ -475,11 +622,17 @@
         <w:br/>
         <w:t xml:space="preserve">    ImportManifest,</w:t>
         <w:br/>
+        <w:t xml:space="preserve">    PersistedAuditLogEntry,</w:t>
+        <w:br/>
         <w:t xml:space="preserve">    SourceReference,</w:t>
+        <w:br/>
+        <w:t xml:space="preserve">    compute_persisted_audit_hash,</w:t>
         <w:br/>
         <w:t xml:space="preserve">    validate_bundle,</w:t>
         <w:br/>
         <w:t xml:space="preserve">    validate_manifest,</w:t>
+        <w:br/>
+        <w:t xml:space="preserve">    verify_persisted_audit_chain,</w:t>
         <w:br/>
         <w:t>)</w:t>
         <w:br/>
@@ -499,6 +652,41 @@
         <w:t>)</w:t>
         <w:br/>
         <w:t>assert chain.verify()</w:t>
+        <w:br/>
+        <w:br/>
+        <w:t>entry_hash = compute_persisted_audit_hash(</w:t>
+        <w:br/>
+        <w:t xml:space="preserve">    previous_hash="0" * 64,</w:t>
+        <w:br/>
+        <w:t xml:space="preserve">    timestamp="2026-05-01T12:00:00+00:00",</w:t>
+        <w:br/>
+        <w:t xml:space="preserve">    actor_id="records-admin",</w:t>
+        <w:br/>
+        <w:t xml:space="preserve">    action="request_created",</w:t>
+        <w:br/>
+        <w:t xml:space="preserve">    details={"request_id": "RR-1001"},</w:t>
+        <w:br/>
+        <w:t>)</w:t>
+        <w:br/>
+        <w:t>assert verify_persisted_audit_chain([</w:t>
+        <w:br/>
+        <w:t xml:space="preserve">    PersistedAuditLogEntry(</w:t>
+        <w:br/>
+        <w:t xml:space="preserve">        previous_hash="0" * 64,</w:t>
+        <w:br/>
+        <w:t xml:space="preserve">        entry_hash=entry_hash,</w:t>
+        <w:br/>
+        <w:t xml:space="preserve">        timestamp="2026-05-01T12:00:00+00:00",</w:t>
+        <w:br/>
+        <w:t xml:space="preserve">        actor_id="records-admin",</w:t>
+        <w:br/>
+        <w:t xml:space="preserve">        action="request_created",</w:t>
+        <w:br/>
+        <w:t xml:space="preserve">        details={"request_id": "RR-1001"},</w:t>
+        <w:br/>
+        <w:t xml:space="preserve">    )</w:t>
+        <w:br/>
+        <w:t>])[0]</w:t>
       </w:r>
     </w:p>
     <w:p>
@@ -513,7 +701,105 @@
     </w:p>
     <w:p>
       <w:pPr>
-        <w:pStyle w:val="Heading2"/>
+        <w:pStyle w:val="Heading3"/>
+      </w:pPr>
+      <w:r>
+        <w:t>Use Live Connector Sync Primitives</w:t>
+      </w:r>
+    </w:p>
+    <w:p>
+      <w:r>
+        <w:t>Use civiccore.connectors for the shared retry and circuit-breaker state</w:t>
+      </w:r>
+    </w:p>
+    <w:p>
+      <w:r>
+        <w:t>machine when a module pulls from a live vendor system. The module still owns</w:t>
+      </w:r>
+    </w:p>
+    <w:p>
+      <w:r>
+        <w:t>its scheduler, tables, credentials, and vendor-specific fetch adapter.</w:t>
+      </w:r>
+    </w:p>
+    <w:p>
+      <w:r>
+        <w:rPr>
+          <w:rFonts w:ascii="Courier New" w:hAnsi="Courier New"/>
+          <w:sz w:val="18"/>
+        </w:rPr>
+        <w:t>from civiccore.connectors import (</w:t>
+        <w:br/>
+        <w:t xml:space="preserve">    SyncCircuitState,</w:t>
+        <w:br/>
+        <w:t xml:space="preserve">    SyncRunResult,</w:t>
+        <w:br/>
+        <w:t xml:space="preserve">    apply_sync_run_result,</w:t>
+        <w:br/>
+        <w:t xml:space="preserve">    build_sync_operator_status,</w:t>
+        <w:br/>
+        <w:t xml:space="preserve">    build_sync_source_status,</w:t>
+        <w:br/>
+        <w:t>)</w:t>
+        <w:br/>
+        <w:br/>
+        <w:t>state = SyncCircuitState(connector="granicus", source_name="Granicus production")</w:t>
+        <w:br/>
+        <w:t>state = apply_sync_run_result(</w:t>
+        <w:br/>
+        <w:t xml:space="preserve">    state,</w:t>
+        <w:br/>
+        <w:t xml:space="preserve">    SyncRunResult(records_discovered=4, records_succeeded=3, records_failed=1),</w:t>
+        <w:br/>
+        <w:t>)</w:t>
+        <w:br/>
+        <w:t>status = build_sync_operator_status(state)</w:t>
+        <w:br/>
+        <w:t>print(status.public_dict()["message"])</w:t>
+        <w:br/>
+        <w:t>source_status = build_sync_source_status(state, sync_schedule="0 2 * * *")</w:t>
+        <w:br/>
+        <w:t>print(source_status.public_dict()["next_sync_at"])</w:t>
+      </w:r>
+    </w:p>
+    <w:p>
+      <w:r>
+        <w:t>Default behavior matches the CivicRecords AI pattern: healthy after successful</w:t>
+      </w:r>
+    </w:p>
+    <w:p>
+      <w:r>
+        <w:t>runs, degraded while failures remain, and circuit-open after five consecutive</w:t>
+      </w:r>
+    </w:p>
+    <w:p>
+      <w:r>
+        <w:t>full-run failures. Grace-period sources open after two full-run failures so</w:t>
+      </w:r>
+    </w:p>
+    <w:p>
+      <w:r>
+        <w:t>operators see the problem before scheduled pulls keep compounding it.</w:t>
+      </w:r>
+    </w:p>
+    <w:p>
+      <w:r>
+        <w:t>Use build_sync_source_status() for list/card views that need the same health</w:t>
+      </w:r>
+    </w:p>
+    <w:p>
+      <w:r>
+        <w:t>decision plus active failure counts, pause state, last status, actionable fix</w:t>
+      </w:r>
+    </w:p>
+    <w:p>
+      <w:r>
+        <w:t>copy, and next scheduled run.</w:t>
+      </w:r>
+    </w:p>
+    <w:p>
+      <w:pPr>
+        <w:pStyle w:val="Heading3"/>
       </w:pPr>
       <w:r>
         <w:t>Run Migrations from a Consumer</w:t>
@@ -541,13 +827,17 @@
     </w:p>
     <w:p>
       <w:r>
-        <w:t>civiccore0001baselinev1 and civiccore0002llm.</w:t>
+        <w:t>civiccore_0001_baseline_v1 and civiccore_0002_llm.</w:t>
       </w:r>
     </w:p>
-    <w:p/>
+    <w:p>
+      <w:r>
+        <w:t>---</w:t>
+      </w:r>
+    </w:p>
     <w:p>
       <w:pPr>
-        <w:pStyle w:val="Heading1"/>
+        <w:pStyle w:val="Heading2"/>
       </w:pPr>
       <w:r>
         <w:t>3. Architecture Reference</w:t>
@@ -555,7 +845,7 @@
     </w:p>
     <w:p>
       <w:pPr>
-        <w:pStyle w:val="Heading2"/>
+        <w:pStyle w:val="Heading3"/>
       </w:pPr>
       <w:r>
         <w:t>Shipped vs Planned</w:t>
@@ -563,26 +853,58 @@
     </w:p>
     <w:p>
       <w:r>
-        <w:t>Diagram: CivicCore shipped vs planned namespaces (see docs/diagrams/civiccore-extraction-map.svg).</w:t>
+        <w:drawing>
+          <wp:inline xmlns:a="http://schemas.openxmlformats.org/drawingml/2006/main" xmlns:pic="http://schemas.openxmlformats.org/drawingml/2006/picture">
+            <wp:extent cx="5486400" cy="6660444"/>
+            <wp:docPr id="1" name="Picture 1"/>
+            <wp:cNvGraphicFramePr>
+              <a:graphicFrameLocks noChangeAspect="1"/>
+            </wp:cNvGraphicFramePr>
+            <a:graphic>
+              <a:graphicData uri="http://schemas.openxmlformats.org/drawingml/2006/picture">
+                <pic:pic>
+                  <pic:nvPicPr>
+                    <pic:cNvPr id="0" name="civiccore-extraction-map.png"/>
+                    <pic:cNvPicPr/>
+                  </pic:nvPicPr>
+                  <pic:blipFill>
+                    <a:blip r:embed="rId9"/>
+                    <a:stretch>
+                      <a:fillRect/>
+                    </a:stretch>
+                  </pic:blipFill>
+                  <pic:spPr>
+                    <a:xfrm>
+                      <a:off x="0" y="0"/>
+                      <a:ext cx="5486400" cy="6660444"/>
+                    </a:xfrm>
+                    <a:prstGeom prst="rect"/>
+                  </pic:spPr>
+                </pic:pic>
+              </a:graphicData>
+            </a:graphic>
+          </wp:inline>
+        </w:drawing>
       </w:r>
     </w:p>
     <w:p>
       <w:r>
-        <w:t>Shipped implementation in v0.3.0:</w:t>
+        <w:t>Shipped implementation in the current development line:</w:t>
       </w:r>
     </w:p>
     <w:p>
       <w:r>
         <w:rPr>
-          <w:rFonts w:ascii="Consolas" w:hAnsi="Consolas"/>
+          <w:rFonts w:ascii="Courier New" w:hAnsi="Courier New"/>
+          <w:sz w:val="18"/>
         </w:rPr>
         <w:t>civiccore/</w:t>
         <w:br/>
-        <w:t xml:space="preserve">  audit/        hash-chained audit primitives</w:t>
+        <w:t xml:space="preserve">  audit/        hash-chained audit primitives and persisted audit-log helpers</w:t>
         <w:br/>
         <w:t xml:space="preserve">  city_profile/ local city/deployment configuration models</w:t>
         <w:br/>
-        <w:t xml:space="preserve">  connectors/   offline import/export manifest schemas</w:t>
+        <w:t xml:space="preserve">  connectors/   offline manifests, local-first import helpers, live-sync primitives</w:t>
         <w:br/>
         <w:t xml:space="preserve">  db/           shared SQLAlchemy declarative Base</w:t>
         <w:br/>
@@ -592,22 +914,27 @@
         <w:br/>
         <w:t xml:space="preserve">  migrations/   migration runner and shared schema baseline</w:t>
         <w:br/>
+        <w:t xml:space="preserve">  notifications/ notice deadline + compliance helpers</w:t>
+        <w:br/>
+        <w:t xml:space="preserve">  onboarding/   shared onboarding profile field-order/progress helpers</w:t>
+        <w:br/>
+        <w:t xml:space="preserve">  scheduling/   cron validation and next-run helpers</w:t>
+        <w:br/>
         <w:t xml:space="preserve">  provenance/   source/citation/provenance metadata contracts</w:t>
       </w:r>
     </w:p>
     <w:p>
       <w:r>
-        <w:t>Planned namespaces in v0.3.0:</w:t>
+        <w:t>Still planned namespaces:</w:t>
       </w:r>
     </w:p>
     <w:p>
       <w:r>
         <w:rPr>
-          <w:rFonts w:ascii="Consolas" w:hAnsi="Consolas"/>
+          <w:rFonts w:ascii="Courier New" w:hAnsi="Courier New"/>
+          <w:sz w:val="18"/>
         </w:rPr>
         <w:t>civiccore/</w:t>
-        <w:br/>
-        <w:t xml:space="preserve">  auth/          future auth/RBAC extraction</w:t>
         <w:br/>
         <w:t xml:space="preserve">  catalog/       future catalog primitives</w:t>
         <w:br/>
@@ -615,20 +942,20 @@
         <w:br/>
         <w:t xml:space="preserve">  ingest/        future document ingestion</w:t>
         <w:br/>
-        <w:t xml:space="preserve">  notifications/ future notification primitives</w:t>
+        <w:t xml:space="preserve">  notifications/ delivery queues and outbound orchestration remain future work</w:t>
         <w:br/>
-        <w:t xml:space="preserve">  onboarding/    future web onboarding flows</w:t>
+        <w:t xml:space="preserve">  onboarding/    future web onboarding UI/persistence flows</w:t>
+        <w:br/>
+        <w:t xml:space="preserve">  scheduling/    scheduler runtime and task queue remain module-owned</w:t>
         <w:br/>
         <w:t xml:space="preserve">  scaffold/      future scaffolding helpers</w:t>
-        <w:br/>
-        <w:t xml:space="preserve">  search/        future hybrid search</w:t>
         <w:br/>
         <w:t xml:space="preserve">  verification/  future sovereignty verification</w:t>
       </w:r>
     </w:p>
     <w:p>
       <w:pPr>
-        <w:pStyle w:val="Heading2"/>
+        <w:pStyle w:val="Heading3"/>
       </w:pPr>
       <w:r>
         <w:t>Migration Order</w:t>
@@ -636,7 +963,38 @@
     </w:p>
     <w:p>
       <w:r>
-        <w:t>Diagram: Migration order (see docs/diagrams/migration-order.svg).</w:t>
+        <w:drawing>
+          <wp:inline xmlns:a="http://schemas.openxmlformats.org/drawingml/2006/main" xmlns:pic="http://schemas.openxmlformats.org/drawingml/2006/picture">
+            <wp:extent cx="5486400" cy="3511296"/>
+            <wp:docPr id="2" name="Picture 2"/>
+            <wp:cNvGraphicFramePr>
+              <a:graphicFrameLocks noChangeAspect="1"/>
+            </wp:cNvGraphicFramePr>
+            <a:graphic>
+              <a:graphicData uri="http://schemas.openxmlformats.org/drawingml/2006/picture">
+                <pic:pic>
+                  <pic:nvPicPr>
+                    <pic:cNvPr id="0" name="migration-order.png"/>
+                    <pic:cNvPicPr/>
+                  </pic:nvPicPr>
+                  <pic:blipFill>
+                    <a:blip r:embed="rId10"/>
+                    <a:stretch>
+                      <a:fillRect/>
+                    </a:stretch>
+                  </pic:blipFill>
+                  <pic:spPr>
+                    <a:xfrm>
+                      <a:off x="0" y="0"/>
+                      <a:ext cx="5486400" cy="3511296"/>
+                    </a:xfrm>
+                    <a:prstGeom prst="rect"/>
+                  </pic:spPr>
+                </pic:pic>
+              </a:graphicData>
+            </a:graphic>
+          </wp:inline>
+        </w:drawing>
       </w:r>
     </w:p>
     <w:p>
@@ -651,7 +1009,7 @@
     </w:p>
     <w:p>
       <w:pPr>
-        <w:pStyle w:val="Heading2"/>
+        <w:pStyle w:val="Heading3"/>
       </w:pPr>
       <w:r>
         <w:t>LLM Provider Abstraction</w:t>
@@ -659,7 +1017,38 @@
     </w:p>
     <w:p>
       <w:r>
-        <w:t>Diagram: Provider abstraction (see docs/diagrams/provider-abstraction.svg).</w:t>
+        <w:drawing>
+          <wp:inline xmlns:a="http://schemas.openxmlformats.org/drawingml/2006/main" xmlns:pic="http://schemas.openxmlformats.org/drawingml/2006/picture">
+            <wp:extent cx="5486400" cy="1717964"/>
+            <wp:docPr id="3" name="Picture 3"/>
+            <wp:cNvGraphicFramePr>
+              <a:graphicFrameLocks noChangeAspect="1"/>
+            </wp:cNvGraphicFramePr>
+            <a:graphic>
+              <a:graphicData uri="http://schemas.openxmlformats.org/drawingml/2006/picture">
+                <pic:pic>
+                  <pic:nvPicPr>
+                    <pic:cNvPr id="0" name="provider-abstraction.png"/>
+                    <pic:cNvPicPr/>
+                  </pic:nvPicPr>
+                  <pic:blipFill>
+                    <a:blip r:embed="rId11"/>
+                    <a:stretch>
+                      <a:fillRect/>
+                    </a:stretch>
+                  </pic:blipFill>
+                  <pic:spPr>
+                    <a:xfrm>
+                      <a:off x="0" y="0"/>
+                      <a:ext cx="5486400" cy="1717964"/>
+                    </a:xfrm>
+                    <a:prstGeom prst="rect"/>
+                  </pic:spPr>
+                </pic:pic>
+              </a:graphicData>
+            </a:graphic>
+          </wp:inline>
+        </w:drawing>
       </w:r>
     </w:p>
     <w:p>
@@ -679,7 +1068,7 @@
     </w:p>
     <w:p>
       <w:pPr>
-        <w:pStyle w:val="Heading2"/>
+        <w:pStyle w:val="Heading3"/>
       </w:pPr>
       <w:r>
         <w:t>Compatibility</w:t>
@@ -687,17 +1076,17 @@
     </w:p>
     <w:p>
       <w:r>
-        <w:t>Current v0.1.0 module foundations still pin civiccore==0.2.0.</w:t>
+        <w:t>Current v0.1.0 module foundations still pin older civiccore lines.</w:t>
       </w:r>
     </w:p>
     <w:p>
       <w:r>
-        <w:t>Production-depth consumers can move to civiccore==0.3.0 after this release</w:t>
+        <w:t>Production-depth consumers can move to civiccore==0.22.1 when the suite</w:t>
       </w:r>
     </w:p>
     <w:p>
       <w:r>
-        <w:t>and the suite compatibility matrix are updated.</w:t>
+        <w:t>compatibility matrix is updated.</w:t>
       </w:r>
     </w:p>
     <w:p>
@@ -710,10 +1099,14 @@
         <w:t>https://github.com/CivicSuite/civicsuite/tree/main/docs/compatibility</w:t>
       </w:r>
     </w:p>
-    <w:p/>
+    <w:p>
+      <w:r>
+        <w:t>---</w:t>
+      </w:r>
+    </w:p>
     <w:p>
       <w:pPr>
-        <w:pStyle w:val="Heading1"/>
+        <w:pStyle w:val="Heading2"/>
       </w:pPr>
       <w:r>
         <w:t>Appendix: Where to File Issues</w:t>
@@ -750,7 +1143,7 @@
     </w:p>
     <w:sectPr>
       <w:pgSz w:w="12240" w:h="15840"/>
-      <w:pgMar w:top="1008" w:right="1080" w:bottom="1008" w:left="1080" w:header="720" w:footer="720" w:gutter="0"/>
+      <w:pgMar w:top="1440" w:right="1800" w:bottom="1440" w:left="1800" w:header="720" w:footer="720" w:gutter="0"/>
       <w:cols w:space="720"/>
       <w:docGrid w:linePitch="360"/>
     </w:sectPr>

</xml_diff>